<commit_message>
Update wording of resume. Move skills to own section.
</commit_message>
<xml_diff>
--- a/target/resume.docx
+++ b/target/resume.docx
@@ -208,7 +208,7 @@
         <w:t xml:space="preserve">Experience</w:t>
       </w:r>
     </w:p>
-    <w:bookmarkStart w:id="28" w:name="datasembly"/>
+    <w:bookmarkStart w:id="27" w:name="datasembly"/>
     <w:p>
       <w:pPr>
         <w:pStyle w:val="Heading2"/>
@@ -263,7 +263,7 @@
         <w:t xml:space="preserve"> </w:t>
       </w:r>
       <w:r>
-        <w:t xml:space="preserve">2022-2024</w:t>
+        <w:t xml:space="preserve">2022–2024</w:t>
       </w:r>
     </w:p>
     <w:p>
@@ -310,7 +310,7 @@
         <w:t xml:space="preserve"> </w:t>
       </w:r>
       <w:r>
-        <w:t xml:space="preserve">2020-2022</w:t>
+        <w:t xml:space="preserve">2020–2022</w:t>
       </w:r>
     </w:p>
     <w:p>
@@ -386,7 +386,7 @@
         </w:numPr>
       </w:pPr>
       <w:r>
-        <w:t xml:space="preserve">Build &amp; maintain web scrapers for grocery domain data</w:t>
+        <w:t xml:space="preserve">Develop and maintain automated data collection systems for grocery-related datasets</w:t>
       </w:r>
     </w:p>
     <w:p>
@@ -398,7 +398,7 @@
         </w:numPr>
       </w:pPr>
       <w:r>
-        <w:t xml:space="preserve">Implement architectural advancements to web scraping framework</w:t>
+        <w:t xml:space="preserve">Reverse engineer proprietary web APIs and integrate them into a unified data pipeline</w:t>
       </w:r>
     </w:p>
     <w:p>
@@ -410,7 +410,7 @@
         </w:numPr>
       </w:pPr>
       <w:r>
-        <w:t xml:space="preserve">Reverse engineer site APIs; adapt to scraping framework</w:t>
+        <w:t xml:space="preserve">Design and implement evasion techniques to ensure high data acquisition success rates</w:t>
       </w:r>
     </w:p>
     <w:p>
@@ -422,31 +422,7 @@
         </w:numPr>
       </w:pPr>
       <w:r>
-        <w:t xml:space="preserve">React to bot detection; develop and apply obfuscation techniques</w:t>
-      </w:r>
-    </w:p>
-    <w:p>
-      <w:pPr>
-        <w:pStyle w:val="Compact"/>
-        <w:numPr>
-          <w:ilvl w:val="0"/>
-          <w:numId w:val="1003"/>
-        </w:numPr>
-      </w:pPr>
-      <w:r>
-        <w:t xml:space="preserve">Work with Product and Customer teams to convert data to actionable insights</w:t>
-      </w:r>
-    </w:p>
-    <w:p>
-      <w:pPr>
-        <w:pStyle w:val="Compact"/>
-        <w:numPr>
-          <w:ilvl w:val="0"/>
-          <w:numId w:val="1003"/>
-        </w:numPr>
-      </w:pPr>
-      <w:r>
-        <w:t xml:space="preserve">Lead domain-specific dictionary initiative</w:t>
+        <w:t xml:space="preserve">Collaborate with Product and Customer teams to transform raw data into actionable insights</w:t>
       </w:r>
     </w:p>
     <w:bookmarkEnd w:id="25"/>
@@ -461,58 +437,196 @@
     </w:p>
     <w:p>
       <w:pPr>
+        <w:pStyle w:val="Compact"/>
+        <w:numPr>
+          <w:ilvl w:val="0"/>
+          <w:numId w:val="1004"/>
+        </w:numPr>
+      </w:pPr>
+      <w:r>
+        <w:t xml:space="preserve">Led development of a Playwright-based browser automation framework, simplifying integration logic and supporting advanced features such as JavaScript rendering, API encryption handling, and dynamic login workflows</w:t>
+      </w:r>
+    </w:p>
+    <w:p>
+      <w:pPr>
+        <w:pStyle w:val="Compact"/>
+        <w:numPr>
+          <w:ilvl w:val="0"/>
+          <w:numId w:val="1004"/>
+        </w:numPr>
+      </w:pPr>
+      <w:r>
+        <w:t xml:space="preserve">Initiated effort to define and standardize the</w:t>
+      </w:r>
+      <w:r>
+        <w:t xml:space="preserve"> </w:t>
+      </w:r>
+      <w:r>
+        <w:t xml:space="preserve">‘</w:t>
+      </w:r>
+      <w:r>
+        <w:t xml:space="preserve">Out-of-Stock</w:t>
+      </w:r>
+      <w:r>
+        <w:t xml:space="preserve">’</w:t>
+      </w:r>
+      <w:r>
+        <w:t xml:space="preserve"> </w:t>
+      </w:r>
+      <w:r>
+        <w:t xml:space="preserve">detection logic, collaborating with cross-functional teams to align on data parsing patterns. Improved understanding, and clarity into data meaning.</w:t>
+      </w:r>
+    </w:p>
+    <w:bookmarkEnd w:id="26"/>
+    <w:bookmarkEnd w:id="27"/>
+    <w:bookmarkStart w:id="31" w:name="hyperfiddle"/>
+    <w:p>
+      <w:pPr>
+        <w:pStyle w:val="Heading2"/>
+      </w:pPr>
+      <w:r>
+        <w:t xml:space="preserve">Hyperfiddle</w:t>
+      </w:r>
+    </w:p>
+    <w:bookmarkStart w:id="28" w:name="roles-1"/>
+    <w:p>
+      <w:pPr>
+        <w:pStyle w:val="Heading3"/>
+      </w:pPr>
+      <w:r>
+        <w:t xml:space="preserve">Roles</w:t>
+      </w:r>
+    </w:p>
+    <w:p>
+      <w:pPr>
+        <w:pStyle w:val="Compact"/>
+        <w:numPr>
+          <w:ilvl w:val="0"/>
+          <w:numId w:val="1005"/>
+        </w:numPr>
+      </w:pPr>
+      <w:r>
+        <w:rPr>
+          <w:b/>
+          <w:bCs/>
+        </w:rPr>
+        <w:t xml:space="preserve">Title:</w:t>
+      </w:r>
+      <w:r>
+        <w:t xml:space="preserve"> </w:t>
+      </w:r>
+      <w:r>
+        <w:t xml:space="preserve">Software Engineer</w:t>
+      </w:r>
+    </w:p>
+    <w:p>
+      <w:pPr>
         <w:pStyle w:val="FirstParagraph"/>
       </w:pPr>
       <w:r>
-        <w:t xml:space="preserve">Developed headless browsing framework in Scala using Playwright</w:t>
-      </w:r>
-    </w:p>
-    <w:p>
-      <w:pPr>
-        <w:pStyle w:val="Compact"/>
-        <w:numPr>
-          <w:ilvl w:val="0"/>
-          <w:numId w:val="1004"/>
-        </w:numPr>
-      </w:pPr>
-      <w:r>
-        <w:t xml:space="preserve">Proposed, by me, to replace the existing framework written in Puppeteer / Javascript</w:t>
-      </w:r>
-    </w:p>
-    <w:p>
-      <w:pPr>
-        <w:pStyle w:val="Compact"/>
-        <w:numPr>
-          <w:ilvl w:val="0"/>
-          <w:numId w:val="1004"/>
-        </w:numPr>
-      </w:pPr>
-      <w:r>
-        <w:t xml:space="preserve">Playwright on the JVM greatly reduced development and deployment fcomplexity; no longer needed to maintain a cluster of headless workers, or a remote execution DSL</w:t>
-      </w:r>
-    </w:p>
-    <w:p>
-      <w:pPr>
-        <w:pStyle w:val="Compact"/>
-        <w:numPr>
-          <w:ilvl w:val="0"/>
-          <w:numId w:val="1004"/>
-        </w:numPr>
-      </w:pPr>
-      <w:r>
-        <w:t xml:space="preserve">Enabled scraping of websites that required Javascript execution, had sufficiently complex login APIs, or employed encryption of API request information</w:t>
-      </w:r>
-    </w:p>
-    <w:p>
-      <w:pPr>
-        <w:pStyle w:val="Compact"/>
-        <w:numPr>
-          <w:ilvl w:val="0"/>
-          <w:numId w:val="1004"/>
-        </w:numPr>
-      </w:pPr>
-      <w:r>
-        <w:t xml:space="preserve">Framework was developed to easily allow different headless browser libraries to be used</w:t>
+        <w:rPr>
+          <w:b/>
+          <w:bCs/>
+        </w:rPr>
+        <w:t xml:space="preserve">Start Date:</w:t>
+      </w:r>
+      <w:r>
+        <w:t xml:space="preserve"> </w:t>
+      </w:r>
+      <w:r>
+        <w:t xml:space="preserve">March 2020</w:t>
+      </w:r>
+    </w:p>
+    <w:p>
+      <w:pPr>
+        <w:pStyle w:val="BodyText"/>
+      </w:pPr>
+      <w:r>
+        <w:rPr>
+          <w:b/>
+          <w:bCs/>
+        </w:rPr>
+        <w:t xml:space="preserve">End Date:</w:t>
+      </w:r>
+      <w:r>
+        <w:t xml:space="preserve"> </w:t>
+      </w:r>
+      <w:r>
+        <w:t xml:space="preserve">September 2020</w:t>
+      </w:r>
+    </w:p>
+    <w:p>
+      <w:pPr>
+        <w:pStyle w:val="BodyText"/>
+      </w:pPr>
+      <w:r>
+        <w:rPr>
+          <w:b/>
+          <w:bCs/>
+        </w:rPr>
+        <w:t xml:space="preserve">Location:</w:t>
+      </w:r>
+      <w:r>
+        <w:t xml:space="preserve"> </w:t>
+      </w:r>
+      <w:r>
+        <w:t xml:space="preserve">Remote</w:t>
+      </w:r>
+    </w:p>
+    <w:bookmarkEnd w:id="28"/>
+    <w:bookmarkStart w:id="29" w:name="responsibilities-1"/>
+    <w:p>
+      <w:pPr>
+        <w:pStyle w:val="Heading3"/>
+      </w:pPr>
+      <w:r>
+        <w:t xml:space="preserve">Responsibilities</w:t>
+      </w:r>
+    </w:p>
+    <w:p>
+      <w:pPr>
+        <w:pStyle w:val="Compact"/>
+        <w:numPr>
+          <w:ilvl w:val="0"/>
+          <w:numId w:val="1006"/>
+        </w:numPr>
+      </w:pPr>
+      <w:r>
+        <w:t xml:space="preserve">Built full-stack features in a Clojure/ClojureScript + Datomic application framework</w:t>
+      </w:r>
+    </w:p>
+    <w:p>
+      <w:pPr>
+        <w:pStyle w:val="Compact"/>
+        <w:numPr>
+          <w:ilvl w:val="0"/>
+          <w:numId w:val="1006"/>
+        </w:numPr>
+      </w:pPr>
+      <w:r>
+        <w:t xml:space="preserve">Implemented CI/CD pipeline using CircleCI, AWS ECR/ECS, and Terraform</w:t>
+      </w:r>
+    </w:p>
+    <w:p>
+      <w:pPr>
+        <w:pStyle w:val="Compact"/>
+        <w:numPr>
+          <w:ilvl w:val="0"/>
+          <w:numId w:val="1006"/>
+        </w:numPr>
+      </w:pPr>
+      <w:r>
+        <w:t xml:space="preserve">Built configurable sample data generation library to support product demos and internal testing workflows</w:t>
+      </w:r>
+    </w:p>
+    <w:bookmarkEnd w:id="29"/>
+    <w:bookmarkStart w:id="30" w:name="projects-1"/>
+    <w:p>
+      <w:pPr>
+        <w:pStyle w:val="Heading3"/>
+      </w:pPr>
+      <w:r>
+        <w:t xml:space="preserve">Projects</w:t>
       </w:r>
     </w:p>
     <w:p>
@@ -520,175 +634,261 @@
         <w:pStyle w:val="FirstParagraph"/>
       </w:pPr>
       <w:r>
-        <w:t xml:space="preserve">Primary Developer who created &amp; maintained scrapers for Amazon, Instacart, and Shipt</w:t>
-      </w:r>
-    </w:p>
-    <w:p>
-      <w:pPr>
-        <w:pStyle w:val="Compact"/>
-        <w:numPr>
-          <w:ilvl w:val="0"/>
-          <w:numId w:val="1005"/>
-        </w:numPr>
-      </w:pPr>
-      <w:r>
-        <w:t xml:space="preserve">Some of the most complex data sources we collected from</w:t>
-      </w:r>
-    </w:p>
-    <w:p>
-      <w:pPr>
-        <w:pStyle w:val="Compact"/>
-        <w:numPr>
-          <w:ilvl w:val="0"/>
-          <w:numId w:val="1005"/>
-        </w:numPr>
-      </w:pPr>
-      <w:r>
-        <w:t xml:space="preserve">Instacart was an easy avenue for collecting new banners, creating fast turn around for new customers</w:t>
-      </w:r>
-    </w:p>
-    <w:p>
-      <w:pPr>
-        <w:pStyle w:val="Compact"/>
-        <w:numPr>
-          <w:ilvl w:val="0"/>
-          <w:numId w:val="1005"/>
-        </w:numPr>
-      </w:pPr>
-      <w:r>
-        <w:t xml:space="preserve">Instituted new code paradigms that others could leverage to make scrapers more legible, and stable</w:t>
-      </w:r>
-    </w:p>
-    <w:bookmarkEnd w:id="26"/>
-    <w:bookmarkStart w:id="27" w:name="skills"/>
+        <w:t xml:space="preserve">Designed an extensible algebra system for Datomic statements</w:t>
+      </w:r>
+    </w:p>
+    <w:p>
+      <w:pPr>
+        <w:pStyle w:val="Compact"/>
+        <w:numPr>
+          <w:ilvl w:val="0"/>
+          <w:numId w:val="1007"/>
+        </w:numPr>
+      </w:pPr>
+      <w:r>
+        <w:t xml:space="preserve">Enabled automatic simplification of negating statements (e.g., 1 + -1 = 0)</w:t>
+      </w:r>
+    </w:p>
+    <w:p>
+      <w:pPr>
+        <w:pStyle w:val="Compact"/>
+        <w:numPr>
+          <w:ilvl w:val="0"/>
+          <w:numId w:val="1007"/>
+        </w:numPr>
+      </w:pPr>
+      <w:r>
+        <w:t xml:space="preserve">Developed frontend logic to emit statements that self-simplify on change</w:t>
+      </w:r>
+    </w:p>
+    <w:p>
+      <w:pPr>
+        <w:pStyle w:val="Compact"/>
+        <w:numPr>
+          <w:ilvl w:val="0"/>
+          <w:numId w:val="1007"/>
+        </w:numPr>
+      </w:pPr>
+      <w:r>
+        <w:t xml:space="preserve">Proved Datomic statements formed an Algebraic Group structure</w:t>
+      </w:r>
+    </w:p>
+    <w:bookmarkEnd w:id="30"/>
+    <w:bookmarkEnd w:id="31"/>
+    <w:bookmarkStart w:id="35" w:name="cornell-university"/>
+    <w:p>
+      <w:pPr>
+        <w:pStyle w:val="Heading2"/>
+      </w:pPr>
+      <w:r>
+        <w:t xml:space="preserve">Cornell University</w:t>
+      </w:r>
+    </w:p>
+    <w:bookmarkStart w:id="32" w:name="roles-2"/>
     <w:p>
       <w:pPr>
         <w:pStyle w:val="Heading3"/>
       </w:pPr>
       <w:r>
-        <w:t xml:space="preserve">Skills</w:t>
-      </w:r>
-    </w:p>
-    <w:p>
-      <w:pPr>
-        <w:pStyle w:val="Compact"/>
-        <w:numPr>
-          <w:ilvl w:val="0"/>
-          <w:numId w:val="1006"/>
-        </w:numPr>
-      </w:pPr>
-      <w:r>
-        <w:t xml:space="preserve">Scala</w:t>
-      </w:r>
-    </w:p>
-    <w:p>
-      <w:pPr>
-        <w:pStyle w:val="Compact"/>
-        <w:numPr>
-          <w:ilvl w:val="0"/>
-          <w:numId w:val="1006"/>
-        </w:numPr>
-      </w:pPr>
-      <w:r>
-        <w:t xml:space="preserve">Scala Cats</w:t>
-      </w:r>
-    </w:p>
-    <w:p>
-      <w:pPr>
-        <w:pStyle w:val="Compact"/>
-        <w:numPr>
-          <w:ilvl w:val="0"/>
-          <w:numId w:val="1006"/>
-        </w:numPr>
-      </w:pPr>
-      <w:r>
-        <w:t xml:space="preserve">Puppeteer / Playwright</w:t>
-      </w:r>
-    </w:p>
-    <w:p>
-      <w:pPr>
-        <w:pStyle w:val="Compact"/>
-        <w:numPr>
-          <w:ilvl w:val="0"/>
-          <w:numId w:val="1006"/>
-        </w:numPr>
-      </w:pPr>
-      <w:r>
-        <w:t xml:space="preserve">SQL</w:t>
-      </w:r>
-    </w:p>
-    <w:p>
-      <w:pPr>
-        <w:pStyle w:val="Compact"/>
-        <w:numPr>
-          <w:ilvl w:val="0"/>
-          <w:numId w:val="1006"/>
-        </w:numPr>
-      </w:pPr>
-      <w:r>
-        <w:t xml:space="preserve">Snowflake</w:t>
-      </w:r>
-    </w:p>
-    <w:p>
-      <w:pPr>
-        <w:pStyle w:val="Compact"/>
-        <w:numPr>
-          <w:ilvl w:val="0"/>
-          <w:numId w:val="1006"/>
-        </w:numPr>
-      </w:pPr>
-      <w:r>
-        <w:t xml:space="preserve">GCP</w:t>
-      </w:r>
-    </w:p>
-    <w:p>
-      <w:pPr>
-        <w:pStyle w:val="Compact"/>
-        <w:numPr>
-          <w:ilvl w:val="0"/>
-          <w:numId w:val="1006"/>
-        </w:numPr>
-      </w:pPr>
-      <w:r>
-        <w:t xml:space="preserve">HTTP Protocol</w:t>
-      </w:r>
-    </w:p>
-    <w:p>
-      <w:pPr>
-        <w:pStyle w:val="Compact"/>
-        <w:numPr>
-          <w:ilvl w:val="0"/>
-          <w:numId w:val="1006"/>
-        </w:numPr>
-      </w:pPr>
-      <w:r>
-        <w:t xml:space="preserve">Airflow</w:t>
-      </w:r>
-    </w:p>
-    <w:p>
-      <w:pPr>
-        <w:pStyle w:val="Compact"/>
-        <w:numPr>
-          <w:ilvl w:val="0"/>
-          <w:numId w:val="1006"/>
-        </w:numPr>
-      </w:pPr>
-      <w:r>
-        <w:t xml:space="preserve">Web Scraping</w:t>
-      </w:r>
-    </w:p>
-    <w:bookmarkEnd w:id="27"/>
-    <w:bookmarkEnd w:id="28"/>
-    <w:bookmarkStart w:id="33" w:name="hyperfiddle"/>
+        <w:t xml:space="preserve">Roles</w:t>
+      </w:r>
+    </w:p>
+    <w:p>
+      <w:pPr>
+        <w:pStyle w:val="Compact"/>
+        <w:numPr>
+          <w:ilvl w:val="0"/>
+          <w:numId w:val="1008"/>
+        </w:numPr>
+      </w:pPr>
+      <w:r>
+        <w:rPr>
+          <w:b/>
+          <w:bCs/>
+        </w:rPr>
+        <w:t xml:space="preserve">Title:</w:t>
+      </w:r>
+      <w:r>
+        <w:t xml:space="preserve"> </w:t>
+      </w:r>
+      <w:r>
+        <w:t xml:space="preserve">Application Programmer II</w:t>
+      </w:r>
+    </w:p>
+    <w:p>
+      <w:pPr>
+        <w:pStyle w:val="FirstParagraph"/>
+      </w:pPr>
+      <w:r>
+        <w:rPr>
+          <w:b/>
+          <w:bCs/>
+        </w:rPr>
+        <w:t xml:space="preserve">Start Date:</w:t>
+      </w:r>
+      <w:r>
+        <w:t xml:space="preserve"> </w:t>
+      </w:r>
+      <w:r>
+        <w:t xml:space="preserve">June 2019</w:t>
+      </w:r>
+    </w:p>
+    <w:p>
+      <w:pPr>
+        <w:pStyle w:val="BodyText"/>
+      </w:pPr>
+      <w:r>
+        <w:rPr>
+          <w:b/>
+          <w:bCs/>
+        </w:rPr>
+        <w:t xml:space="preserve">End Date:</w:t>
+      </w:r>
+      <w:r>
+        <w:t xml:space="preserve"> </w:t>
+      </w:r>
+      <w:r>
+        <w:t xml:space="preserve">June 2020</w:t>
+      </w:r>
+    </w:p>
+    <w:p>
+      <w:pPr>
+        <w:pStyle w:val="BodyText"/>
+      </w:pPr>
+      <w:r>
+        <w:rPr>
+          <w:b/>
+          <w:bCs/>
+        </w:rPr>
+        <w:t xml:space="preserve">Location:</w:t>
+      </w:r>
+      <w:r>
+        <w:t xml:space="preserve"> </w:t>
+      </w:r>
+      <w:r>
+        <w:t xml:space="preserve">Ithaca New York</w:t>
+      </w:r>
+    </w:p>
+    <w:bookmarkEnd w:id="32"/>
+    <w:bookmarkStart w:id="33" w:name="responsibilities-2"/>
+    <w:p>
+      <w:pPr>
+        <w:pStyle w:val="Heading3"/>
+      </w:pPr>
+      <w:r>
+        <w:t xml:space="preserve">Responsibilities</w:t>
+      </w:r>
+    </w:p>
+    <w:p>
+      <w:pPr>
+        <w:pStyle w:val="FirstParagraph"/>
+      </w:pPr>
+      <w:r>
+        <w:t xml:space="preserve">Improved genomic CSV digester application</w:t>
+      </w:r>
+    </w:p>
+    <w:p>
+      <w:pPr>
+        <w:pStyle w:val="Compact"/>
+        <w:numPr>
+          <w:ilvl w:val="0"/>
+          <w:numId w:val="1009"/>
+        </w:numPr>
+      </w:pPr>
+      <w:r>
+        <w:t xml:space="preserve">Simplified instruction fiel format, reducing redundancy (V2)</w:t>
+      </w:r>
+    </w:p>
+    <w:p>
+      <w:pPr>
+        <w:pStyle w:val="Compact"/>
+        <w:numPr>
+          <w:ilvl w:val="0"/>
+          <w:numId w:val="1009"/>
+        </w:numPr>
+      </w:pPr>
+      <w:r>
+        <w:t xml:space="preserve">Rewrote digester to be more generic and powerful, developed declaritive Aspect Files (v32)</w:t>
+      </w:r>
+    </w:p>
+    <w:p>
+      <w:pPr>
+        <w:pStyle w:val="Compact"/>
+        <w:numPr>
+          <w:ilvl w:val="0"/>
+          <w:numId w:val="1009"/>
+        </w:numPr>
+      </w:pPr>
+      <w:r>
+        <w:t xml:space="preserve">Created a file translator to convert instruction files between V1, V2, and V3 in Clojure(script)</w:t>
+      </w:r>
+    </w:p>
+    <w:bookmarkEnd w:id="33"/>
+    <w:bookmarkStart w:id="34" w:name="projects-2"/>
+    <w:p>
+      <w:pPr>
+        <w:pStyle w:val="Heading3"/>
+      </w:pPr>
+      <w:r>
+        <w:t xml:space="preserve">Projects</w:t>
+      </w:r>
+    </w:p>
+    <w:p>
+      <w:pPr>
+        <w:pStyle w:val="FirstParagraph"/>
+      </w:pPr>
+      <w:r>
+        <w:t xml:space="preserve">Developed framework for automated end-to-end testing</w:t>
+      </w:r>
+    </w:p>
+    <w:p>
+      <w:pPr>
+        <w:pStyle w:val="Compact"/>
+        <w:numPr>
+          <w:ilvl w:val="0"/>
+          <w:numId w:val="1010"/>
+        </w:numPr>
+      </w:pPr>
+      <w:r>
+        <w:t xml:space="preserve">Created a domain-specific scripting langauge for test structure: Arrange/Act, Assert, Cleanup</w:t>
+      </w:r>
+    </w:p>
+    <w:p>
+      <w:pPr>
+        <w:pStyle w:val="Compact"/>
+        <w:numPr>
+          <w:ilvl w:val="0"/>
+          <w:numId w:val="1010"/>
+        </w:numPr>
+      </w:pPr>
+      <w:r>
+        <w:t xml:space="preserve">Clojure for backend, Java for business logic, and custom syntax for test specifics</w:t>
+      </w:r>
+    </w:p>
+    <w:p>
+      <w:pPr>
+        <w:pStyle w:val="Compact"/>
+        <w:numPr>
+          <w:ilvl w:val="0"/>
+          <w:numId w:val="1010"/>
+        </w:numPr>
+      </w:pPr>
+      <w:r>
+        <w:t xml:space="preserve">Ensured test independnence and idempotency in production environments</w:t>
+      </w:r>
+    </w:p>
+    <w:bookmarkEnd w:id="34"/>
+    <w:bookmarkEnd w:id="35"/>
+    <w:bookmarkStart w:id="38" w:name="intuit"/>
     <w:p>
       <w:pPr>
         <w:pStyle w:val="Heading2"/>
       </w:pPr>
       <w:r>
-        <w:t xml:space="preserve">Hyperfiddle</w:t>
-      </w:r>
-    </w:p>
-    <w:bookmarkStart w:id="29" w:name="roles-1"/>
+        <w:t xml:space="preserve">Intuit</w:t>
+      </w:r>
+    </w:p>
+    <w:bookmarkStart w:id="36" w:name="roles-3"/>
     <w:p>
       <w:pPr>
         <w:pStyle w:val="Heading3"/>
@@ -702,7 +902,7 @@
         <w:pStyle w:val="Compact"/>
         <w:numPr>
           <w:ilvl w:val="0"/>
-          <w:numId w:val="1007"/>
+          <w:numId w:val="1011"/>
         </w:numPr>
       </w:pPr>
       <w:r>
@@ -716,7 +916,7 @@
         <w:t xml:space="preserve"> </w:t>
       </w:r>
       <w:r>
-        <w:t xml:space="preserve">Software Engineer Contractor</w:t>
+        <w:t xml:space="preserve">Software Engineer Co-Op</w:t>
       </w:r>
     </w:p>
     <w:p>
@@ -734,7 +934,7 @@
         <w:t xml:space="preserve"> </w:t>
       </w:r>
       <w:r>
-        <w:t xml:space="preserve">March 2020</w:t>
+        <w:t xml:space="preserve">Jan 2018</w:t>
       </w:r>
     </w:p>
     <w:p>
@@ -752,7 +952,7 @@
         <w:t xml:space="preserve"> </w:t>
       </w:r>
       <w:r>
-        <w:t xml:space="preserve">September 2020</w:t>
+        <w:t xml:space="preserve">July 2018</w:t>
       </w:r>
     </w:p>
     <w:p>
@@ -770,11 +970,11 @@
         <w:t xml:space="preserve"> </w:t>
       </w:r>
       <w:r>
-        <w:t xml:space="preserve">Remote</w:t>
-      </w:r>
-    </w:p>
-    <w:bookmarkEnd w:id="29"/>
-    <w:bookmarkStart w:id="30" w:name="responsibilities-1"/>
+        <w:t xml:space="preserve">Mountain View, CA</w:t>
+      </w:r>
+    </w:p>
+    <w:bookmarkEnd w:id="36"/>
+    <w:bookmarkStart w:id="37" w:name="responsibilities-3"/>
     <w:p>
       <w:pPr>
         <w:pStyle w:val="Heading3"/>
@@ -788,543 +988,41 @@
         <w:pStyle w:val="Compact"/>
         <w:numPr>
           <w:ilvl w:val="0"/>
-          <w:numId w:val="1008"/>
-        </w:numPr>
-      </w:pPr>
-      <w:r>
-        <w:t xml:space="preserve">Development on Full Stack Clojure (script), Datomic CRUD application framework</w:t>
-      </w:r>
-    </w:p>
-    <w:p>
-      <w:pPr>
-        <w:pStyle w:val="Compact"/>
-        <w:numPr>
-          <w:ilvl w:val="0"/>
-          <w:numId w:val="1008"/>
-        </w:numPr>
-      </w:pPr>
-      <w:r>
-        <w:t xml:space="preserve">Setup CI/CD pipeline using CircleCI and AWS ECR and ECS, configured in Terraform</w:t>
-      </w:r>
-    </w:p>
-    <w:bookmarkEnd w:id="30"/>
-    <w:bookmarkStart w:id="31" w:name="projects-1"/>
-    <w:p>
-      <w:pPr>
-        <w:pStyle w:val="Heading3"/>
-      </w:pPr>
-      <w:r>
-        <w:t xml:space="preserve">Projects</w:t>
-      </w:r>
-    </w:p>
-    <w:p>
-      <w:pPr>
-        <w:pStyle w:val="FirstParagraph"/>
-      </w:pPr>
-      <w:r>
-        <w:t xml:space="preserve">Formalized extensible algebra for Datomic statements</w:t>
-      </w:r>
-    </w:p>
-    <w:p>
-      <w:pPr>
-        <w:pStyle w:val="Compact"/>
-        <w:numPr>
-          <w:ilvl w:val="0"/>
-          <w:numId w:val="1009"/>
-        </w:numPr>
-      </w:pPr>
-      <w:r>
-        <w:t xml:space="preserve">Algebra supported simplification of negating statments (eg. 1 + -1 = 0)</w:t>
-      </w:r>
-    </w:p>
-    <w:p>
-      <w:pPr>
-        <w:pStyle w:val="Compact"/>
-        <w:numPr>
-          <w:ilvl w:val="0"/>
-          <w:numId w:val="1009"/>
-        </w:numPr>
-      </w:pPr>
-      <w:r>
-        <w:t xml:space="preserve">Frontend logic would submit new statements on change, and the state would self simplify</w:t>
-      </w:r>
-    </w:p>
-    <w:p>
-      <w:pPr>
-        <w:pStyle w:val="Compact"/>
-        <w:numPr>
-          <w:ilvl w:val="0"/>
-          <w:numId w:val="1009"/>
-        </w:numPr>
-      </w:pPr>
-      <w:r>
-        <w:t xml:space="preserve">Datomic statements were proved to form an Algebraic Group</w:t>
-      </w:r>
-    </w:p>
-    <w:p>
-      <w:pPr>
-        <w:pStyle w:val="FirstParagraph"/>
-      </w:pPr>
-      <w:r>
-        <w:t xml:space="preserve">Research and Development</w:t>
-      </w:r>
-    </w:p>
-    <w:p>
-      <w:pPr>
-        <w:pStyle w:val="Compact"/>
-        <w:numPr>
-          <w:ilvl w:val="0"/>
-          <w:numId w:val="1010"/>
-        </w:numPr>
-      </w:pPr>
-      <w:r>
-        <w:t xml:space="preserve">Reactive streams for rendering in Clojurescript</w:t>
-      </w:r>
-    </w:p>
-    <w:p>
-      <w:pPr>
-        <w:pStyle w:val="Compact"/>
-        <w:numPr>
-          <w:ilvl w:val="0"/>
-          <w:numId w:val="1010"/>
-        </w:numPr>
-      </w:pPr>
-      <w:r>
-        <w:t xml:space="preserve">Category theory-based programming in Clojure</w:t>
-      </w:r>
-    </w:p>
-    <w:p>
-      <w:pPr>
-        <w:pStyle w:val="Compact"/>
-        <w:numPr>
-          <w:ilvl w:val="0"/>
-          <w:numId w:val="1010"/>
-        </w:numPr>
-      </w:pPr>
-      <w:r>
-        <w:t xml:space="preserve">Pattern Matching algorithms</w:t>
-      </w:r>
-    </w:p>
-    <w:bookmarkEnd w:id="31"/>
-    <w:bookmarkStart w:id="32" w:name="skills-1"/>
-    <w:p>
-      <w:pPr>
-        <w:pStyle w:val="Heading3"/>
-      </w:pPr>
-      <w:r>
-        <w:t xml:space="preserve">Skills</w:t>
-      </w:r>
-    </w:p>
-    <w:p>
-      <w:pPr>
-        <w:pStyle w:val="Compact"/>
-        <w:numPr>
-          <w:ilvl w:val="0"/>
-          <w:numId w:val="1011"/>
-        </w:numPr>
-      </w:pPr>
-      <w:r>
-        <w:t xml:space="preserve">Clojure(script)</w:t>
-      </w:r>
-    </w:p>
-    <w:p>
-      <w:pPr>
-        <w:pStyle w:val="Compact"/>
-        <w:numPr>
-          <w:ilvl w:val="0"/>
-          <w:numId w:val="1011"/>
-        </w:numPr>
-      </w:pPr>
-      <w:r>
-        <w:t xml:space="preserve">Datomic</w:t>
-      </w:r>
-    </w:p>
-    <w:p>
-      <w:pPr>
-        <w:pStyle w:val="Compact"/>
-        <w:numPr>
-          <w:ilvl w:val="0"/>
-          <w:numId w:val="1011"/>
-        </w:numPr>
-      </w:pPr>
-      <w:r>
-        <w:t xml:space="preserve">Reactive Streams</w:t>
-      </w:r>
-    </w:p>
-    <w:p>
-      <w:pPr>
-        <w:pStyle w:val="Compact"/>
-        <w:numPr>
-          <w:ilvl w:val="0"/>
-          <w:numId w:val="1011"/>
-        </w:numPr>
-      </w:pPr>
-      <w:r>
-        <w:t xml:space="preserve">Haxe</w:t>
-      </w:r>
-    </w:p>
-    <w:p>
-      <w:pPr>
-        <w:pStyle w:val="Compact"/>
-        <w:numPr>
-          <w:ilvl w:val="0"/>
-          <w:numId w:val="1011"/>
-        </w:numPr>
-      </w:pPr>
-      <w:r>
-        <w:t xml:space="preserve">AWS</w:t>
-      </w:r>
-    </w:p>
-    <w:p>
-      <w:pPr>
-        <w:pStyle w:val="Compact"/>
-        <w:numPr>
-          <w:ilvl w:val="0"/>
-          <w:numId w:val="1011"/>
-        </w:numPr>
-      </w:pPr>
-      <w:r>
-        <w:t xml:space="preserve">Terraform</w:t>
-      </w:r>
-    </w:p>
-    <w:p>
-      <w:pPr>
-        <w:pStyle w:val="Compact"/>
-        <w:numPr>
-          <w:ilvl w:val="0"/>
-          <w:numId w:val="1011"/>
-        </w:numPr>
-      </w:pPr>
-      <w:r>
-        <w:t xml:space="preserve">Docker</w:t>
-      </w:r>
-    </w:p>
-    <w:bookmarkEnd w:id="32"/>
-    <w:bookmarkEnd w:id="33"/>
-    <w:bookmarkStart w:id="38" w:name="cornell-university"/>
-    <w:p>
-      <w:pPr>
-        <w:pStyle w:val="Heading2"/>
-      </w:pPr>
-      <w:r>
-        <w:t xml:space="preserve">Cornell University</w:t>
-      </w:r>
-    </w:p>
-    <w:bookmarkStart w:id="34" w:name="roles-2"/>
-    <w:p>
-      <w:pPr>
-        <w:pStyle w:val="Heading3"/>
-      </w:pPr>
-      <w:r>
-        <w:t xml:space="preserve">Roles</w:t>
-      </w:r>
-    </w:p>
-    <w:p>
-      <w:pPr>
-        <w:pStyle w:val="Compact"/>
-        <w:numPr>
-          <w:ilvl w:val="0"/>
           <w:numId w:val="1012"/>
         </w:numPr>
       </w:pPr>
       <w:r>
-        <w:rPr>
-          <w:b/>
-          <w:bCs/>
-        </w:rPr>
-        <w:t xml:space="preserve">Title:</w:t>
-      </w:r>
-      <w:r>
-        <w:t xml:space="preserve"> </w:t>
-      </w:r>
-      <w:r>
-        <w:t xml:space="preserve">Application Programmer II</w:t>
-      </w:r>
-    </w:p>
-    <w:p>
-      <w:pPr>
-        <w:pStyle w:val="FirstParagraph"/>
-      </w:pPr>
-      <w:r>
-        <w:rPr>
-          <w:b/>
-          <w:bCs/>
-        </w:rPr>
-        <w:t xml:space="preserve">Start Date:</w:t>
-      </w:r>
-      <w:r>
-        <w:t xml:space="preserve"> </w:t>
-      </w:r>
-      <w:r>
-        <w:t xml:space="preserve">June 2019</w:t>
-      </w:r>
-    </w:p>
-    <w:p>
-      <w:pPr>
-        <w:pStyle w:val="BodyText"/>
-      </w:pPr>
-      <w:r>
-        <w:rPr>
-          <w:b/>
-          <w:bCs/>
-        </w:rPr>
-        <w:t xml:space="preserve">End Date:</w:t>
-      </w:r>
-      <w:r>
-        <w:t xml:space="preserve"> </w:t>
-      </w:r>
-      <w:r>
-        <w:t xml:space="preserve">June 2020</w:t>
-      </w:r>
-    </w:p>
-    <w:p>
-      <w:pPr>
-        <w:pStyle w:val="BodyText"/>
-      </w:pPr>
-      <w:r>
-        <w:rPr>
-          <w:b/>
-          <w:bCs/>
-        </w:rPr>
-        <w:t xml:space="preserve">Location:</w:t>
-      </w:r>
-      <w:r>
-        <w:t xml:space="preserve"> </w:t>
-      </w:r>
-      <w:r>
-        <w:t xml:space="preserve">Ithaca New York</w:t>
-      </w:r>
-    </w:p>
-    <w:bookmarkEnd w:id="34"/>
-    <w:bookmarkStart w:id="35" w:name="responsibilities-2"/>
-    <w:p>
-      <w:pPr>
-        <w:pStyle w:val="Heading3"/>
-      </w:pPr>
-      <w:r>
-        <w:t xml:space="preserve">Responsibilities</w:t>
-      </w:r>
-    </w:p>
-    <w:p>
-      <w:pPr>
-        <w:pStyle w:val="FirstParagraph"/>
-      </w:pPr>
-      <w:r>
-        <w:t xml:space="preserve">Improved genomic CSV digester application</w:t>
-      </w:r>
-    </w:p>
-    <w:p>
-      <w:pPr>
-        <w:pStyle w:val="Compact"/>
-        <w:numPr>
-          <w:ilvl w:val="0"/>
-          <w:numId w:val="1013"/>
-        </w:numPr>
-      </w:pPr>
-      <w:r>
-        <w:t xml:space="preserve">Simplified instruction file format, reducing redundancy and improving readability (V2)</w:t>
-      </w:r>
-    </w:p>
-    <w:p>
-      <w:pPr>
-        <w:pStyle w:val="Compact"/>
-        <w:numPr>
-          <w:ilvl w:val="0"/>
-          <w:numId w:val="1013"/>
-        </w:numPr>
-      </w:pPr>
-      <w:r>
-        <w:t xml:space="preserve">Rewrote digester to be generic; now uses Aspect Files that describe the CSV to be loaded (V3)</w:t>
-      </w:r>
-    </w:p>
-    <w:p>
-      <w:pPr>
-        <w:pStyle w:val="FirstParagraph"/>
-      </w:pPr>
-      <w:r>
-        <w:t xml:space="preserve">Wrote file translator to convert instructions files between V1, V2, and V3; written in Clojure(script) both as command line utility, and web app</w:t>
-      </w:r>
-    </w:p>
-    <w:bookmarkEnd w:id="35"/>
-    <w:bookmarkStart w:id="36" w:name="projects-2"/>
-    <w:p>
-      <w:pPr>
-        <w:pStyle w:val="Heading3"/>
-      </w:pPr>
-      <w:r>
-        <w:t xml:space="preserve">Projects</w:t>
-      </w:r>
-    </w:p>
-    <w:p>
-      <w:pPr>
-        <w:pStyle w:val="FirstParagraph"/>
-      </w:pPr>
-      <w:r>
-        <w:t xml:space="preserve">Worked on backend of genomic data ETL application</w:t>
-      </w:r>
-    </w:p>
-    <w:p>
-      <w:pPr>
-        <w:pStyle w:val="BodyText"/>
-      </w:pPr>
-      <w:r>
-        <w:t xml:space="preserve">Created CSV file digest framework (See Digester Project Below)</w:t>
-      </w:r>
-    </w:p>
-    <w:p>
-      <w:pPr>
-        <w:pStyle w:val="Compact"/>
-        <w:numPr>
-          <w:ilvl w:val="0"/>
-          <w:numId w:val="1014"/>
-        </w:numPr>
-      </w:pPr>
-      <w:r>
-        <w:t xml:space="preserve">Provided a data file, and a descriptive aspect file, the application produces a stream tuples that would be committed to a database.</w:t>
-      </w:r>
-    </w:p>
-    <w:p>
-      <w:pPr>
-        <w:pStyle w:val="Compact"/>
-        <w:numPr>
-          <w:ilvl w:val="0"/>
-          <w:numId w:val="1014"/>
-        </w:numPr>
-      </w:pPr>
-      <w:r>
-        <w:t xml:space="preserve">Aspects would be used to generate streams of cells; these streams would be aligned based on properties of each aspect</w:t>
-      </w:r>
-    </w:p>
-    <w:p>
-      <w:pPr>
-        <w:pStyle w:val="Compact"/>
-        <w:numPr>
-          <w:ilvl w:val="0"/>
-          <w:numId w:val="1014"/>
-        </w:numPr>
-      </w:pPr>
-      <w:r>
-        <w:t xml:space="preserve">Written in Java; strong focus on an object-oriented design</w:t>
-      </w:r>
-    </w:p>
-    <w:p>
-      <w:pPr>
-        <w:pStyle w:val="FirstParagraph"/>
-      </w:pPr>
-      <w:r>
-        <w:t xml:space="preserve">Developed framework for automated end-to-end testing; focused on composability, ease of use, and self-cleanup (See Ernie Project Below)</w:t>
-      </w:r>
-    </w:p>
-    <w:p>
-      <w:pPr>
-        <w:pStyle w:val="Compact"/>
-        <w:numPr>
-          <w:ilvl w:val="0"/>
-          <w:numId w:val="1015"/>
-        </w:numPr>
-      </w:pPr>
-      <w:r>
-        <w:t xml:space="preserve">Developed domain-specific scripting language to simplify semantic layer of test suit in 3 layers: Arrange/Act, Assert, and Cleanup</w:t>
-      </w:r>
-    </w:p>
-    <w:p>
-      <w:pPr>
-        <w:pStyle w:val="Compact"/>
-        <w:numPr>
-          <w:ilvl w:val="0"/>
-          <w:numId w:val="1015"/>
-        </w:numPr>
-      </w:pPr>
-      <w:r>
-        <w:t xml:space="preserve">Was built in 3 separate components: A language backend (written in Clojure), a business logic middle layer (written in Java), and a testing logic script suite (written in custom syntax)</w:t>
-      </w:r>
-    </w:p>
-    <w:p>
-      <w:pPr>
-        <w:pStyle w:val="Compact"/>
-        <w:numPr>
-          <w:ilvl w:val="0"/>
-          <w:numId w:val="1015"/>
-        </w:numPr>
-      </w:pPr>
-      <w:r>
-        <w:t xml:space="preserve">Cleanup ensured automatic test independence and idempotency; tests were often run on deployed production environments]</w:t>
-      </w:r>
-    </w:p>
-    <w:bookmarkEnd w:id="36"/>
-    <w:bookmarkStart w:id="37" w:name="skills-2"/>
-    <w:p>
-      <w:pPr>
-        <w:pStyle w:val="Heading3"/>
-      </w:pPr>
-      <w:r>
-        <w:t xml:space="preserve">Skills</w:t>
-      </w:r>
-    </w:p>
-    <w:p>
-      <w:pPr>
-        <w:pStyle w:val="Compact"/>
-        <w:numPr>
-          <w:ilvl w:val="0"/>
-          <w:numId w:val="1016"/>
-        </w:numPr>
-      </w:pPr>
-      <w:r>
-        <w:t xml:space="preserve">Java</w:t>
-      </w:r>
-    </w:p>
-    <w:p>
-      <w:pPr>
-        <w:pStyle w:val="Compact"/>
-        <w:numPr>
-          <w:ilvl w:val="0"/>
-          <w:numId w:val="1016"/>
-        </w:numPr>
-      </w:pPr>
-      <w:r>
-        <w:t xml:space="preserve">Clojure</w:t>
-      </w:r>
-    </w:p>
-    <w:p>
-      <w:pPr>
-        <w:pStyle w:val="Compact"/>
-        <w:numPr>
-          <w:ilvl w:val="0"/>
-          <w:numId w:val="1016"/>
-        </w:numPr>
-      </w:pPr>
-      <w:r>
-        <w:t xml:space="preserve">Docker</w:t>
-      </w:r>
-    </w:p>
-    <w:p>
-      <w:pPr>
-        <w:pStyle w:val="Compact"/>
-        <w:numPr>
-          <w:ilvl w:val="0"/>
-          <w:numId w:val="1016"/>
-        </w:numPr>
-      </w:pPr>
-      <w:r>
-        <w:t xml:space="preserve">PostgreSQL</w:t>
-      </w:r>
-    </w:p>
-    <w:p>
-      <w:pPr>
-        <w:pStyle w:val="Compact"/>
-        <w:numPr>
-          <w:ilvl w:val="0"/>
-          <w:numId w:val="1016"/>
-        </w:numPr>
-      </w:pPr>
-      <w:r>
-        <w:t xml:space="preserve">Object-Oriented Design</w:t>
+        <w:t xml:space="preserve">Contributed to an agile team developing microservices for account creation workflows</w:t>
+      </w:r>
+    </w:p>
+    <w:p>
+      <w:pPr>
+        <w:pStyle w:val="Compact"/>
+        <w:numPr>
+          <w:ilvl w:val="0"/>
+          <w:numId w:val="1012"/>
+        </w:numPr>
+      </w:pPr>
+      <w:r>
+        <w:t xml:space="preserve">Implemented a document upload endpoint for identity verification during onboarding</w:t>
+      </w:r>
+    </w:p>
+    <w:p>
+      <w:pPr>
+        <w:pStyle w:val="Compact"/>
+        <w:numPr>
+          <w:ilvl w:val="0"/>
+          <w:numId w:val="1012"/>
+        </w:numPr>
+      </w:pPr>
+      <w:r>
+        <w:t xml:space="preserve">Increased test reliability and confidence by expanding unit test coverage across critical components</w:t>
       </w:r>
     </w:p>
     <w:bookmarkEnd w:id="37"/>
     <w:bookmarkEnd w:id="38"/>
     <w:bookmarkEnd w:id="39"/>
-    <w:bookmarkStart w:id="40" w:name="skills-3"/>
+    <w:bookmarkStart w:id="45" w:name="skills"/>
     <w:p>
       <w:pPr>
         <w:pStyle w:val="Heading1"/>
@@ -1333,6 +1031,331 @@
         <w:t xml:space="preserve">Skills</w:t>
       </w:r>
     </w:p>
+    <w:bookmarkStart w:id="40" w:name="programming-languages"/>
+    <w:p>
+      <w:pPr>
+        <w:pStyle w:val="Heading2"/>
+      </w:pPr>
+      <w:r>
+        <w:t xml:space="preserve">Programming Languages</w:t>
+      </w:r>
+    </w:p>
+    <w:p>
+      <w:pPr>
+        <w:pStyle w:val="Compact"/>
+        <w:numPr>
+          <w:ilvl w:val="0"/>
+          <w:numId w:val="1013"/>
+        </w:numPr>
+      </w:pPr>
+      <w:r>
+        <w:t xml:space="preserve">Scala</w:t>
+      </w:r>
+    </w:p>
+    <w:p>
+      <w:pPr>
+        <w:pStyle w:val="Compact"/>
+        <w:numPr>
+          <w:ilvl w:val="0"/>
+          <w:numId w:val="1013"/>
+        </w:numPr>
+      </w:pPr>
+      <w:r>
+        <w:t xml:space="preserve">Clojure(script)</w:t>
+      </w:r>
+    </w:p>
+    <w:p>
+      <w:pPr>
+        <w:pStyle w:val="Compact"/>
+        <w:numPr>
+          <w:ilvl w:val="0"/>
+          <w:numId w:val="1013"/>
+        </w:numPr>
+      </w:pPr>
+      <w:r>
+        <w:t xml:space="preserve">Java</w:t>
+      </w:r>
+    </w:p>
+    <w:p>
+      <w:pPr>
+        <w:pStyle w:val="Compact"/>
+        <w:numPr>
+          <w:ilvl w:val="0"/>
+          <w:numId w:val="1013"/>
+        </w:numPr>
+      </w:pPr>
+      <w:r>
+        <w:t xml:space="preserve">SQL</w:t>
+      </w:r>
+    </w:p>
+    <w:p>
+      <w:pPr>
+        <w:pStyle w:val="Compact"/>
+        <w:numPr>
+          <w:ilvl w:val="0"/>
+          <w:numId w:val="1013"/>
+        </w:numPr>
+      </w:pPr>
+      <w:r>
+        <w:t xml:space="preserve">Rust</w:t>
+      </w:r>
+    </w:p>
+    <w:p>
+      <w:pPr>
+        <w:pStyle w:val="Compact"/>
+        <w:numPr>
+          <w:ilvl w:val="0"/>
+          <w:numId w:val="1013"/>
+        </w:numPr>
+      </w:pPr>
+      <w:r>
+        <w:t xml:space="preserve">Python</w:t>
+      </w:r>
+    </w:p>
+    <w:p>
+      <w:pPr>
+        <w:pStyle w:val="Compact"/>
+        <w:numPr>
+          <w:ilvl w:val="0"/>
+          <w:numId w:val="1013"/>
+        </w:numPr>
+      </w:pPr>
+      <w:r>
+        <w:t xml:space="preserve">Javascript</w:t>
+      </w:r>
+    </w:p>
+    <w:bookmarkEnd w:id="40"/>
+    <w:bookmarkStart w:id="41" w:name="infrastructure"/>
+    <w:p>
+      <w:pPr>
+        <w:pStyle w:val="Heading2"/>
+      </w:pPr>
+      <w:r>
+        <w:t xml:space="preserve">Infrastructure</w:t>
+      </w:r>
+    </w:p>
+    <w:p>
+      <w:pPr>
+        <w:pStyle w:val="Compact"/>
+        <w:numPr>
+          <w:ilvl w:val="0"/>
+          <w:numId w:val="1014"/>
+        </w:numPr>
+      </w:pPr>
+      <w:r>
+        <w:t xml:space="preserve">PostgreSQL</w:t>
+      </w:r>
+    </w:p>
+    <w:p>
+      <w:pPr>
+        <w:pStyle w:val="Compact"/>
+        <w:numPr>
+          <w:ilvl w:val="0"/>
+          <w:numId w:val="1014"/>
+        </w:numPr>
+      </w:pPr>
+      <w:r>
+        <w:t xml:space="preserve">Snowflake</w:t>
+      </w:r>
+    </w:p>
+    <w:p>
+      <w:pPr>
+        <w:pStyle w:val="Compact"/>
+        <w:numPr>
+          <w:ilvl w:val="0"/>
+          <w:numId w:val="1014"/>
+        </w:numPr>
+      </w:pPr>
+      <w:r>
+        <w:t xml:space="preserve">Airflow</w:t>
+      </w:r>
+    </w:p>
+    <w:p>
+      <w:pPr>
+        <w:pStyle w:val="Compact"/>
+        <w:numPr>
+          <w:ilvl w:val="0"/>
+          <w:numId w:val="1014"/>
+        </w:numPr>
+      </w:pPr>
+      <w:r>
+        <w:t xml:space="preserve">MySQL</w:t>
+      </w:r>
+    </w:p>
+    <w:p>
+      <w:pPr>
+        <w:pStyle w:val="Compact"/>
+        <w:numPr>
+          <w:ilvl w:val="0"/>
+          <w:numId w:val="1014"/>
+        </w:numPr>
+      </w:pPr>
+      <w:r>
+        <w:t xml:space="preserve">Kafka</w:t>
+      </w:r>
+    </w:p>
+    <w:p>
+      <w:pPr>
+        <w:pStyle w:val="Compact"/>
+        <w:numPr>
+          <w:ilvl w:val="0"/>
+          <w:numId w:val="1014"/>
+        </w:numPr>
+      </w:pPr>
+      <w:r>
+        <w:t xml:space="preserve">Linux</w:t>
+      </w:r>
+    </w:p>
+    <w:bookmarkEnd w:id="41"/>
+    <w:bookmarkStart w:id="42" w:name="devops"/>
+    <w:p>
+      <w:pPr>
+        <w:pStyle w:val="Heading2"/>
+      </w:pPr>
+      <w:r>
+        <w:t xml:space="preserve">Devops</w:t>
+      </w:r>
+    </w:p>
+    <w:p>
+      <w:pPr>
+        <w:pStyle w:val="Compact"/>
+        <w:numPr>
+          <w:ilvl w:val="0"/>
+          <w:numId w:val="1015"/>
+        </w:numPr>
+      </w:pPr>
+      <w:r>
+        <w:t xml:space="preserve">Docker</w:t>
+      </w:r>
+    </w:p>
+    <w:p>
+      <w:pPr>
+        <w:pStyle w:val="Compact"/>
+        <w:numPr>
+          <w:ilvl w:val="0"/>
+          <w:numId w:val="1015"/>
+        </w:numPr>
+      </w:pPr>
+      <w:r>
+        <w:t xml:space="preserve">Terraform</w:t>
+      </w:r>
+    </w:p>
+    <w:p>
+      <w:pPr>
+        <w:pStyle w:val="Compact"/>
+        <w:numPr>
+          <w:ilvl w:val="0"/>
+          <w:numId w:val="1015"/>
+        </w:numPr>
+      </w:pPr>
+      <w:r>
+        <w:t xml:space="preserve">GCP</w:t>
+      </w:r>
+    </w:p>
+    <w:p>
+      <w:pPr>
+        <w:pStyle w:val="Compact"/>
+        <w:numPr>
+          <w:ilvl w:val="0"/>
+          <w:numId w:val="1015"/>
+        </w:numPr>
+      </w:pPr>
+      <w:r>
+        <w:t xml:space="preserve">AWS</w:t>
+      </w:r>
+    </w:p>
+    <w:p>
+      <w:pPr>
+        <w:pStyle w:val="Compact"/>
+        <w:numPr>
+          <w:ilvl w:val="0"/>
+          <w:numId w:val="1015"/>
+        </w:numPr>
+      </w:pPr>
+      <w:r>
+        <w:t xml:space="preserve">CircleCI</w:t>
+      </w:r>
+    </w:p>
+    <w:p>
+      <w:pPr>
+        <w:pStyle w:val="Compact"/>
+        <w:numPr>
+          <w:ilvl w:val="0"/>
+          <w:numId w:val="1015"/>
+        </w:numPr>
+      </w:pPr>
+      <w:r>
+        <w:t xml:space="preserve">Bamboo</w:t>
+      </w:r>
+    </w:p>
+    <w:bookmarkEnd w:id="42"/>
+    <w:bookmarkStart w:id="43" w:name="monitoring"/>
+    <w:p>
+      <w:pPr>
+        <w:pStyle w:val="Heading2"/>
+      </w:pPr>
+      <w:r>
+        <w:t xml:space="preserve">Monitoring</w:t>
+      </w:r>
+    </w:p>
+    <w:p>
+      <w:pPr>
+        <w:pStyle w:val="Compact"/>
+        <w:numPr>
+          <w:ilvl w:val="0"/>
+          <w:numId w:val="1016"/>
+        </w:numPr>
+      </w:pPr>
+      <w:r>
+        <w:t xml:space="preserve">Grafana</w:t>
+      </w:r>
+    </w:p>
+    <w:p>
+      <w:pPr>
+        <w:pStyle w:val="Compact"/>
+        <w:numPr>
+          <w:ilvl w:val="0"/>
+          <w:numId w:val="1016"/>
+        </w:numPr>
+      </w:pPr>
+      <w:r>
+        <w:t xml:space="preserve">Prometheus</w:t>
+      </w:r>
+    </w:p>
+    <w:p>
+      <w:pPr>
+        <w:pStyle w:val="Compact"/>
+        <w:numPr>
+          <w:ilvl w:val="0"/>
+          <w:numId w:val="1016"/>
+        </w:numPr>
+      </w:pPr>
+      <w:r>
+        <w:t xml:space="preserve">BugSplat</w:t>
+      </w:r>
+    </w:p>
+    <w:p>
+      <w:pPr>
+        <w:pStyle w:val="Compact"/>
+        <w:numPr>
+          <w:ilvl w:val="0"/>
+          <w:numId w:val="1016"/>
+        </w:numPr>
+      </w:pPr>
+      <w:r>
+        <w:t xml:space="preserve">Slack Integration</w:t>
+      </w:r>
+    </w:p>
+    <w:bookmarkEnd w:id="43"/>
+    <w:bookmarkStart w:id="44" w:name="theory"/>
+    <w:p>
+      <w:pPr>
+        <w:pStyle w:val="Heading2"/>
+      </w:pPr>
+      <w:r>
+        <w:t xml:space="preserve">Theory</w:t>
+      </w:r>
+    </w:p>
     <w:p>
       <w:pPr>
         <w:pStyle w:val="Compact"/>
@@ -1342,7 +1365,7 @@
         </w:numPr>
       </w:pPr>
       <w:r>
-        <w:t xml:space="preserve">Java</w:t>
+        <w:t xml:space="preserve">Functional Programming</w:t>
       </w:r>
     </w:p>
     <w:p>
@@ -1354,7 +1377,7 @@
         </w:numPr>
       </w:pPr>
       <w:r>
-        <w:t xml:space="preserve">Clojure(script)</w:t>
+        <w:t xml:space="preserve">Object Oriented Programming</w:t>
       </w:r>
     </w:p>
     <w:p>
@@ -1366,7 +1389,7 @@
         </w:numPr>
       </w:pPr>
       <w:r>
-        <w:t xml:space="preserve">Scala</w:t>
+        <w:t xml:space="preserve">Type Theory</w:t>
       </w:r>
     </w:p>
     <w:p>
@@ -1378,7 +1401,7 @@
         </w:numPr>
       </w:pPr>
       <w:r>
-        <w:t xml:space="preserve">Docker</w:t>
+        <w:t xml:space="preserve">Language &amp; Framework Design</w:t>
       </w:r>
     </w:p>
     <w:p>
@@ -1390,59 +1413,12 @@
         </w:numPr>
       </w:pPr>
       <w:r>
-        <w:t xml:space="preserve">Google Cloud</w:t>
-      </w:r>
-    </w:p>
-    <w:p>
-      <w:pPr>
-        <w:pStyle w:val="Compact"/>
-        <w:numPr>
-          <w:ilvl w:val="0"/>
-          <w:numId w:val="1017"/>
-        </w:numPr>
-      </w:pPr>
-      <w:r>
-        <w:t xml:space="preserve">Aiflow</w:t>
-      </w:r>
-    </w:p>
-    <w:p>
-      <w:pPr>
-        <w:pStyle w:val="Compact"/>
-        <w:numPr>
-          <w:ilvl w:val="0"/>
-          <w:numId w:val="1017"/>
-        </w:numPr>
-      </w:pPr>
-      <w:r>
-        <w:t xml:space="preserve">Snowflake</w:t>
-      </w:r>
-    </w:p>
-    <w:p>
-      <w:pPr>
-        <w:pStyle w:val="Compact"/>
-        <w:numPr>
-          <w:ilvl w:val="0"/>
-          <w:numId w:val="1017"/>
-        </w:numPr>
-      </w:pPr>
-      <w:r>
-        <w:t xml:space="preserve">Airflow</w:t>
-      </w:r>
-    </w:p>
-    <w:p>
-      <w:pPr>
-        <w:pStyle w:val="Compact"/>
-        <w:numPr>
-          <w:ilvl w:val="0"/>
-          <w:numId w:val="1017"/>
-        </w:numPr>
-      </w:pPr>
-      <w:r>
-        <w:t xml:space="preserve">SQL</w:t>
-      </w:r>
-    </w:p>
-    <w:bookmarkEnd w:id="40"/>
-    <w:bookmarkStart w:id="41" w:name="projects-3"/>
+        <w:t xml:space="preserve">Typed Functional Programming</w:t>
+      </w:r>
+    </w:p>
+    <w:bookmarkEnd w:id="44"/>
+    <w:bookmarkEnd w:id="45"/>
+    <w:bookmarkStart w:id="46" w:name="projects-3"/>
     <w:p>
       <w:pPr>
         <w:pStyle w:val="Heading1"/>
@@ -1769,7 +1745,7 @@
         <w:t xml:space="preserve">https://bitbucket.org/gobiiproject/gobii.masticator/src/develop/</w:t>
       </w:r>
     </w:p>
-    <w:bookmarkEnd w:id="41"/>
+    <w:bookmarkEnd w:id="46"/>
     <w:sectPr/>
   </w:body>
 </w:document>
@@ -1808,7 +1784,7 @@
       <w:lvlText w:val=" "/>
       <w:lvlJc w:val="left"/>
       <w:pPr>
-        <w:ind w:left="720" w:hanging="360"/>
+        <w:ind w:left="720" w:hanging="480"/>
       </w:pPr>
     </w:lvl>
     <w:lvl w:ilvl="1">
@@ -1816,7 +1792,7 @@
       <w:lvlText w:val=" "/>
       <w:lvlJc w:val="left"/>
       <w:pPr>
-        <w:ind w:left="1440" w:hanging="360"/>
+        <w:ind w:left="1440" w:hanging="480"/>
       </w:pPr>
     </w:lvl>
     <w:lvl w:ilvl="2">
@@ -1824,7 +1800,7 @@
       <w:lvlText w:val=" "/>
       <w:lvlJc w:val="left"/>
       <w:pPr>
-        <w:ind w:left="2160" w:hanging="360"/>
+        <w:ind w:left="2160" w:hanging="480"/>
       </w:pPr>
     </w:lvl>
     <w:lvl w:ilvl="3">
@@ -1832,7 +1808,7 @@
       <w:lvlText w:val=" "/>
       <w:lvlJc w:val="left"/>
       <w:pPr>
-        <w:ind w:left="2880" w:hanging="360"/>
+        <w:ind w:left="2880" w:hanging="480"/>
       </w:pPr>
     </w:lvl>
     <w:lvl w:ilvl="4">
@@ -1840,7 +1816,7 @@
       <w:lvlText w:val=" "/>
       <w:lvlJc w:val="left"/>
       <w:pPr>
-        <w:ind w:left="3600" w:hanging="360"/>
+        <w:ind w:left="3600" w:hanging="480"/>
       </w:pPr>
     </w:lvl>
     <w:lvl w:ilvl="5">
@@ -1848,7 +1824,7 @@
       <w:lvlText w:val=" "/>
       <w:lvlJc w:val="left"/>
       <w:pPr>
-        <w:ind w:left="4320" w:hanging="360"/>
+        <w:ind w:left="4320" w:hanging="480"/>
       </w:pPr>
     </w:lvl>
     <w:lvl w:ilvl="6">
@@ -1856,7 +1832,7 @@
       <w:lvlText w:val=" "/>
       <w:lvlJc w:val="left"/>
       <w:pPr>
-        <w:ind w:left="5040" w:hanging="360"/>
+        <w:ind w:left="5040" w:hanging="480"/>
       </w:pPr>
     </w:lvl>
     <w:lvl w:ilvl="7">
@@ -1864,7 +1840,7 @@
       <w:lvlText w:val=" "/>
       <w:lvlJc w:val="left"/>
       <w:pPr>
-        <w:ind w:left="5760" w:hanging="360"/>
+        <w:ind w:left="5760" w:hanging="480"/>
       </w:pPr>
     </w:lvl>
     <w:lvl w:ilvl="8">
@@ -1872,7 +1848,7 @@
       <w:lvlText w:val=" "/>
       <w:lvlJc w:val="left"/>
       <w:pPr>
-        <w:ind w:left="6480" w:hanging="360"/>
+        <w:ind w:left="6480" w:hanging="480"/>
       </w:pPr>
     </w:lvl>
   </w:abstractNum>
@@ -1881,102 +1857,75 @@
     <w:multiLevelType w:val="multilevel"/>
     <w:lvl w:ilvl="0">
       <w:numFmt w:val="bullet"/>
-      <w:lvlText w:val=""/>
+      <w:lvlText w:val="•"/>
       <w:lvlJc w:val="left"/>
       <w:pPr>
-        <w:ind w:left="720" w:hanging="360"/>
-      </w:pPr>
-      <w:rPr>
-        <w:rFonts w:ascii="Symbol" w:hAnsi="Symbol" w:cs="Symbol" w:hint="default"/>
-      </w:rPr>
+        <w:ind w:left="720" w:hanging="480"/>
+      </w:pPr>
     </w:lvl>
     <w:lvl w:ilvl="1">
       <w:numFmt w:val="bullet"/>
-      <w:lvlText w:val="o"/>
+      <w:lvlText w:val="–"/>
       <w:lvlJc w:val="left"/>
       <w:pPr>
-        <w:ind w:left="1440" w:hanging="360"/>
-      </w:pPr>
-      <w:rPr>
-        <w:rFonts w:ascii="Courier New" w:hAnsi="Courier New" w:cs="Courier New" w:hint="default"/>
-      </w:rPr>
+        <w:ind w:left="1440" w:hanging="480"/>
+      </w:pPr>
     </w:lvl>
     <w:lvl w:ilvl="2">
       <w:numFmt w:val="bullet"/>
-      <w:lvlText w:val=""/>
+      <w:lvlText w:val="•"/>
       <w:lvlJc w:val="left"/>
       <w:pPr>
-        <w:ind w:left="2160" w:hanging="360"/>
-      </w:pPr>
-      <w:rPr>
-        <w:rFonts w:ascii="Wingdings" w:hAnsi="Wingdings" w:cs="Wingdings" w:hint="default"/>
-      </w:rPr>
+        <w:ind w:left="2160" w:hanging="480"/>
+      </w:pPr>
     </w:lvl>
     <w:lvl w:ilvl="3">
       <w:numFmt w:val="bullet"/>
-      <w:lvlText w:val=""/>
+      <w:lvlText w:val="–"/>
       <w:lvlJc w:val="left"/>
       <w:pPr>
-        <w:ind w:left="2880" w:hanging="360"/>
-      </w:pPr>
-      <w:rPr>
-        <w:rFonts w:ascii="Symbol" w:hAnsi="Symbol" w:cs="Symbol" w:hint="default"/>
-      </w:rPr>
+        <w:ind w:left="2880" w:hanging="480"/>
+      </w:pPr>
     </w:lvl>
     <w:lvl w:ilvl="4">
       <w:numFmt w:val="bullet"/>
-      <w:lvlText w:val="o"/>
+      <w:lvlText w:val="•"/>
       <w:lvlJc w:val="left"/>
       <w:pPr>
-        <w:ind w:left="3600" w:hanging="360"/>
-      </w:pPr>
-      <w:rPr>
-        <w:rFonts w:ascii="Courier New" w:hAnsi="Courier New" w:cs="Courier New" w:hint="default"/>
-      </w:rPr>
+        <w:ind w:left="3600" w:hanging="480"/>
+      </w:pPr>
     </w:lvl>
     <w:lvl w:ilvl="5">
       <w:numFmt w:val="bullet"/>
-      <w:lvlText w:val=""/>
+      <w:lvlText w:val="–"/>
       <w:lvlJc w:val="left"/>
       <w:pPr>
-        <w:ind w:left="4320" w:hanging="360"/>
-      </w:pPr>
-      <w:rPr>
-        <w:rFonts w:ascii="Wingdings" w:hAnsi="Wingdings" w:cs="Wingdings" w:hint="default"/>
-      </w:rPr>
+        <w:ind w:left="4320" w:hanging="480"/>
+      </w:pPr>
     </w:lvl>
     <w:lvl w:ilvl="6">
       <w:numFmt w:val="bullet"/>
-      <w:lvlText w:val=""/>
+      <w:lvlText w:val="•"/>
       <w:lvlJc w:val="left"/>
       <w:pPr>
-        <w:ind w:left="5040" w:hanging="360"/>
-      </w:pPr>
-      <w:rPr>
-        <w:rFonts w:ascii="Symbol" w:hAnsi="Symbol" w:cs="Symbol" w:hint="default"/>
-      </w:rPr>
+        <w:ind w:left="5040" w:hanging="480"/>
+      </w:pPr>
     </w:lvl>
     <w:lvl w:ilvl="7">
       <w:numFmt w:val="bullet"/>
-      <w:lvlText w:val="o"/>
+      <w:lvlText w:val="–"/>
       <w:lvlJc w:val="left"/>
       <w:pPr>
-        <w:ind w:left="5760" w:hanging="360"/>
-      </w:pPr>
-      <w:rPr>
-        <w:rFonts w:ascii="Courier New" w:hAnsi="Courier New" w:cs="Courier New" w:hint="default"/>
-      </w:rPr>
+        <w:ind w:left="5760" w:hanging="480"/>
+      </w:pPr>
     </w:lvl>
     <w:lvl w:ilvl="8">
       <w:numFmt w:val="bullet"/>
-      <w:lvlText w:val=""/>
+      <w:lvlText w:val="•"/>
       <w:lvlJc w:val="left"/>
       <w:pPr>
-        <w:ind w:left="6480" w:hanging="360"/>
-      </w:pPr>
-      <w:rPr>
-        <w:rFonts w:ascii="Wingdings" w:hAnsi="Wingdings" w:cs="Wingdings" w:hint="default"/>
-      </w:rPr>
+        <w:ind w:left="6480" w:hanging="480"/>
+      </w:pPr>
     </w:lvl>
   </w:abstractNum>
   <w:num w:numId="1000">
@@ -2100,69 +2049,36 @@
     <w:name w:val="Title"/>
     <w:basedOn w:val="Normal"/>
     <w:next w:val="BodyText"/>
-    <w:link w:val="TitleChar"/>
-    <w:uiPriority w:val="10"/>
     <w:qFormat/>
-    <w:rsid w:val="00A10FD9"/>
     <w:pPr>
-      <w:spacing w:after="80" w:line="240" w:lineRule="auto"/>
-      <w:contextualSpacing/>
+      <w:keepNext/>
+      <w:keepLines/>
+      <w:spacing w:after="240" w:before="480"/>
       <w:jc w:val="center"/>
     </w:pPr>
     <w:rPr>
       <w:rFonts w:asciiTheme="majorHAnsi" w:cstheme="majorBidi" w:eastAsiaTheme="majorEastAsia" w:hAnsiTheme="majorHAnsi"/>
-      <w:spacing w:val="-10"/>
-      <w:kern w:val="28"/>
-      <w:sz w:val="56"/>
-      <w:szCs w:val="56"/>
-    </w:rPr>
-  </w:style>
-  <w:style w:customStyle="1" w:styleId="TitleChar" w:type="character">
-    <w:name w:val="Title Char"/>
-    <w:basedOn w:val="DefaultParagraphFont"/>
-    <w:link w:val="Title"/>
-    <w:uiPriority w:val="10"/>
-    <w:rsid w:val="00A10FD9"/>
-    <w:rPr>
-      <w:rFonts w:asciiTheme="majorHAnsi" w:cstheme="majorBidi" w:eastAsiaTheme="majorEastAsia" w:hAnsiTheme="majorHAnsi"/>
-      <w:spacing w:val="-10"/>
-      <w:kern w:val="28"/>
-      <w:sz w:val="56"/>
-      <w:szCs w:val="56"/>
+      <w:b/>
+      <w:bCs/>
+      <w:color w:themeColor="accent1" w:themeShade="B5" w:val="345A8A"/>
+      <w:sz w:val="36"/>
+      <w:szCs w:val="36"/>
     </w:rPr>
   </w:style>
   <w:style w:styleId="Subtitle" w:type="paragraph">
     <w:name w:val="Subtitle"/>
     <w:basedOn w:val="Title"/>
     <w:next w:val="BodyText"/>
-    <w:link w:val="SubtitleChar"/>
-    <w:uiPriority w:val="11"/>
     <w:qFormat/>
-    <w:rsid w:val="00A10FD9"/>
     <w:pPr>
-      <w:numPr>
-        <w:ilvl w:val="1"/>
-      </w:numPr>
+      <w:keepNext/>
+      <w:keepLines/>
+      <w:spacing w:after="240" w:before="240"/>
+      <w:jc w:val="center"/>
     </w:pPr>
     <w:rPr>
-      <w:rFonts w:cstheme="majorBidi" w:eastAsiaTheme="majorEastAsia"/>
-      <w:spacing w:val="15"/>
-      <w:sz w:val="28"/>
-      <w:szCs w:val="28"/>
-    </w:rPr>
-  </w:style>
-  <w:style w:customStyle="1" w:styleId="SubtitleChar" w:type="character">
-    <w:name w:val="Subtitle Char"/>
-    <w:basedOn w:val="DefaultParagraphFont"/>
-    <w:link w:val="Subtitle"/>
-    <w:uiPriority w:val="11"/>
-    <w:rsid w:val="00A10FD9"/>
-    <w:rPr>
-      <w:rFonts w:cstheme="majorBidi" w:eastAsiaTheme="majorEastAsia"/>
-      <w:color w:themeColor="text1" w:themeTint="A6" w:val="595959"/>
-      <w:spacing w:val="15"/>
-      <w:sz w:val="28"/>
-      <w:szCs w:val="28"/>
+      <w:sz w:val="30"/>
+      <w:szCs w:val="30"/>
     </w:rPr>
   </w:style>
   <w:style w:customStyle="1" w:styleId="Author" w:type="paragraph">
@@ -2198,6 +2114,7 @@
     </w:pPr>
     <w:rPr>
       <w:b/>
+      <w:color w:val="345A8A"/>
       <w:sz w:val="20"/>
       <w:szCs w:val="20"/>
     </w:rPr>
@@ -2226,321 +2143,191 @@
     <w:rPr/>
   </w:style>
   <w:style w:styleId="Heading1" w:type="paragraph">
-    <w:name w:val="heading 1"/>
+    <w:name w:val="Heading 1"/>
     <w:basedOn w:val="Normal"/>
     <w:next w:val="BodyText"/>
-    <w:link w:val="Heading1Char"/>
     <w:uiPriority w:val="9"/>
     <w:qFormat/>
-    <w:rsid w:val="00A10FD9"/>
     <w:pPr>
       <w:keepNext/>
       <w:keepLines/>
-      <w:spacing w:after="80" w:before="360"/>
+      <w:spacing w:after="0" w:before="480"/>
       <w:outlineLvl w:val="0"/>
     </w:pPr>
     <w:rPr>
       <w:rFonts w:asciiTheme="majorHAnsi" w:cstheme="majorBidi" w:eastAsiaTheme="majorEastAsia" w:hAnsiTheme="majorHAnsi"/>
-      <w:color w:themeColor="accent1" w:themeShade="BF" w:val="0F4761"/>
-      <w:sz w:val="40"/>
-      <w:szCs w:val="40"/>
+      <w:b/>
+      <w:bCs/>
+      <w:color w:themeColor="accent1" w:val="4F81BD"/>
+      <w:sz w:val="32"/>
+      <w:szCs w:val="32"/>
     </w:rPr>
   </w:style>
   <w:style w:styleId="Heading2" w:type="paragraph">
-    <w:name w:val="heading 2"/>
+    <w:name w:val="Heading 2"/>
     <w:basedOn w:val="Normal"/>
     <w:next w:val="BodyText"/>
-    <w:link w:val="Heading2Char"/>
     <w:uiPriority w:val="9"/>
-    <w:semiHidden/>
     <w:unhideWhenUsed/>
     <w:qFormat/>
-    <w:rsid w:val="00A10FD9"/>
     <w:pPr>
       <w:keepNext/>
       <w:keepLines/>
-      <w:spacing w:after="80" w:before="160"/>
+      <w:spacing w:after="0" w:before="200"/>
       <w:outlineLvl w:val="1"/>
     </w:pPr>
     <w:rPr>
       <w:rFonts w:asciiTheme="majorHAnsi" w:cstheme="majorBidi" w:eastAsiaTheme="majorEastAsia" w:hAnsiTheme="majorHAnsi"/>
-      <w:color w:themeColor="accent1" w:themeShade="BF" w:val="0F4761"/>
-      <w:sz w:val="32"/>
-      <w:szCs w:val="32"/>
+      <w:b/>
+      <w:bCs/>
+      <w:color w:themeColor="accent1" w:val="4F81BD"/>
+      <w:sz w:val="28"/>
+      <w:szCs w:val="28"/>
     </w:rPr>
   </w:style>
   <w:style w:styleId="Heading3" w:type="paragraph">
-    <w:name w:val="heading 3"/>
+    <w:name w:val="Heading 3"/>
     <w:basedOn w:val="Normal"/>
     <w:next w:val="BodyText"/>
-    <w:link w:val="Heading3Char"/>
     <w:uiPriority w:val="9"/>
-    <w:semiHidden/>
     <w:unhideWhenUsed/>
     <w:qFormat/>
-    <w:rsid w:val="00A10FD9"/>
     <w:pPr>
       <w:keepNext/>
       <w:keepLines/>
-      <w:spacing w:after="80" w:before="160"/>
+      <w:spacing w:after="0" w:before="200"/>
       <w:outlineLvl w:val="2"/>
     </w:pPr>
     <w:rPr>
-      <w:rFonts w:cstheme="majorBidi" w:eastAsiaTheme="majorEastAsia"/>
-      <w:color w:themeColor="accent1" w:themeShade="BF" w:val="0F4761"/>
-      <w:sz w:val="28"/>
-      <w:szCs w:val="28"/>
+      <w:rFonts w:asciiTheme="majorHAnsi" w:cstheme="majorBidi" w:eastAsiaTheme="majorEastAsia" w:hAnsiTheme="majorHAnsi"/>
+      <w:b/>
+      <w:bCs/>
+      <w:color w:themeColor="accent1" w:val="4F81BD"/>
+      <w:sz w:val="24"/>
+      <w:szCs w:val="24"/>
     </w:rPr>
   </w:style>
   <w:style w:styleId="Heading4" w:type="paragraph">
-    <w:name w:val="heading 4"/>
+    <w:name w:val="Heading 4"/>
     <w:basedOn w:val="Normal"/>
     <w:next w:val="BodyText"/>
-    <w:link w:val="Heading4Char"/>
     <w:uiPriority w:val="9"/>
-    <w:semiHidden/>
     <w:unhideWhenUsed/>
     <w:qFormat/>
-    <w:rsid w:val="00A10FD9"/>
     <w:pPr>
       <w:keepNext/>
       <w:keepLines/>
-      <w:spacing w:after="40" w:before="80"/>
+      <w:spacing w:after="0" w:before="200"/>
       <w:outlineLvl w:val="3"/>
     </w:pPr>
     <w:rPr>
-      <w:rFonts w:cstheme="majorBidi" w:eastAsiaTheme="majorEastAsia"/>
+      <w:rFonts w:asciiTheme="majorHAnsi" w:cstheme="majorBidi" w:eastAsiaTheme="majorEastAsia" w:hAnsiTheme="majorHAnsi"/>
+      <w:bCs/>
       <w:i/>
-      <w:iCs/>
-      <w:color w:themeColor="accent1" w:themeShade="BF" w:val="0F4761"/>
+      <w:color w:themeColor="accent1" w:val="4F81BD"/>
+      <w:sz w:val="24"/>
+      <w:szCs w:val="24"/>
     </w:rPr>
   </w:style>
   <w:style w:styleId="Heading5" w:type="paragraph">
-    <w:name w:val="heading 5"/>
+    <w:name w:val="Heading 5"/>
     <w:basedOn w:val="Normal"/>
     <w:next w:val="BodyText"/>
-    <w:link w:val="Heading5Char"/>
     <w:uiPriority w:val="9"/>
-    <w:semiHidden/>
     <w:unhideWhenUsed/>
     <w:qFormat/>
-    <w:rsid w:val="00A10FD9"/>
     <w:pPr>
       <w:keepNext/>
       <w:keepLines/>
-      <w:spacing w:after="40" w:before="80"/>
+      <w:spacing w:after="0" w:before="200"/>
       <w:outlineLvl w:val="4"/>
     </w:pPr>
     <w:rPr>
-      <w:rFonts w:cstheme="majorBidi" w:eastAsiaTheme="majorEastAsia"/>
-      <w:color w:themeColor="accent1" w:themeShade="BF" w:val="0F4761"/>
+      <w:rFonts w:asciiTheme="majorHAnsi" w:cstheme="majorBidi" w:eastAsiaTheme="majorEastAsia" w:hAnsiTheme="majorHAnsi"/>
+      <w:iCs/>
+      <w:color w:themeColor="accent1" w:val="4F81BD"/>
+      <w:sz w:val="24"/>
+      <w:szCs w:val="24"/>
     </w:rPr>
   </w:style>
   <w:style w:styleId="Heading6" w:type="paragraph">
-    <w:name w:val="heading 6"/>
+    <w:name w:val="Heading 6"/>
     <w:basedOn w:val="Normal"/>
     <w:next w:val="BodyText"/>
-    <w:link w:val="Heading6Char"/>
     <w:uiPriority w:val="9"/>
-    <w:semiHidden/>
     <w:unhideWhenUsed/>
     <w:qFormat/>
-    <w:rsid w:val="00A10FD9"/>
     <w:pPr>
       <w:keepNext/>
       <w:keepLines/>
-      <w:spacing w:after="0" w:before="40"/>
+      <w:spacing w:after="0" w:before="200"/>
       <w:outlineLvl w:val="5"/>
     </w:pPr>
     <w:rPr>
-      <w:rFonts w:cstheme="majorBidi" w:eastAsiaTheme="majorEastAsia"/>
-      <w:i/>
-      <w:iCs/>
-      <w:color w:themeColor="text1" w:themeTint="A6" w:val="595959"/>
+      <w:rFonts w:asciiTheme="majorHAnsi" w:cstheme="majorBidi" w:eastAsiaTheme="majorEastAsia" w:hAnsiTheme="majorHAnsi"/>
+      <w:color w:themeColor="accent1" w:val="4F81BD"/>
+      <w:sz w:val="24"/>
+      <w:szCs w:val="24"/>
     </w:rPr>
   </w:style>
   <w:style w:styleId="Heading7" w:type="paragraph">
-    <w:name w:val="heading 7"/>
+    <w:name w:val="Heading 7"/>
     <w:basedOn w:val="Normal"/>
     <w:next w:val="BodyText"/>
-    <w:link w:val="Heading7Char"/>
     <w:uiPriority w:val="9"/>
-    <w:semiHidden/>
     <w:unhideWhenUsed/>
     <w:qFormat/>
-    <w:rsid w:val="00A10FD9"/>
     <w:pPr>
       <w:keepNext/>
       <w:keepLines/>
-      <w:spacing w:after="0" w:before="40"/>
+      <w:spacing w:after="0" w:before="200"/>
       <w:outlineLvl w:val="6"/>
     </w:pPr>
     <w:rPr>
-      <w:rFonts w:cstheme="majorBidi" w:eastAsiaTheme="majorEastAsia"/>
-      <w:color w:themeColor="text1" w:themeTint="A6" w:val="595959"/>
+      <w:rFonts w:asciiTheme="majorHAnsi" w:cstheme="majorBidi" w:eastAsiaTheme="majorEastAsia" w:hAnsiTheme="majorHAnsi"/>
+      <w:color w:themeColor="accent1" w:val="4F81BD"/>
+      <w:sz w:val="24"/>
+      <w:szCs w:val="24"/>
     </w:rPr>
   </w:style>
   <w:style w:styleId="Heading8" w:type="paragraph">
-    <w:name w:val="heading 8"/>
+    <w:name w:val="Heading 8"/>
     <w:basedOn w:val="Normal"/>
     <w:next w:val="BodyText"/>
-    <w:link w:val="Heading8Char"/>
     <w:uiPriority w:val="9"/>
-    <w:semiHidden/>
     <w:unhideWhenUsed/>
     <w:qFormat/>
-    <w:rsid w:val="00A10FD9"/>
     <w:pPr>
       <w:keepNext/>
       <w:keepLines/>
-      <w:spacing w:after="0"/>
+      <w:spacing w:after="0" w:before="200"/>
       <w:outlineLvl w:val="7"/>
     </w:pPr>
     <w:rPr>
-      <w:rFonts w:cstheme="majorBidi" w:eastAsiaTheme="majorEastAsia"/>
-      <w:i/>
-      <w:iCs/>
-      <w:color w:themeColor="text1" w:themeTint="D8" w:val="272727"/>
+      <w:rFonts w:asciiTheme="majorHAnsi" w:cstheme="majorBidi" w:eastAsiaTheme="majorEastAsia" w:hAnsiTheme="majorHAnsi"/>
+      <w:color w:themeColor="accent1" w:val="4F81BD"/>
+      <w:sz w:val="24"/>
+      <w:szCs w:val="24"/>
     </w:rPr>
   </w:style>
   <w:style w:styleId="Heading9" w:type="paragraph">
-    <w:name w:val="heading 9"/>
+    <w:name w:val="Heading 9"/>
     <w:basedOn w:val="Normal"/>
     <w:next w:val="BodyText"/>
-    <w:link w:val="Heading9Char"/>
     <w:uiPriority w:val="9"/>
-    <w:semiHidden/>
     <w:unhideWhenUsed/>
     <w:qFormat/>
-    <w:rsid w:val="00A10FD9"/>
     <w:pPr>
       <w:keepNext/>
       <w:keepLines/>
-      <w:spacing w:after="0"/>
+      <w:spacing w:after="0" w:before="200"/>
       <w:outlineLvl w:val="8"/>
     </w:pPr>
     <w:rPr>
-      <w:rFonts w:cstheme="majorBidi" w:eastAsiaTheme="majorEastAsia"/>
-      <w:color w:themeColor="text1" w:themeTint="D8" w:val="272727"/>
-    </w:rPr>
-  </w:style>
-  <w:style w:customStyle="1" w:styleId="Heading1Char" w:type="character">
-    <w:name w:val="Heading 1 Char"/>
-    <w:basedOn w:val="DefaultParagraphFont"/>
-    <w:link w:val="Heading1"/>
-    <w:uiPriority w:val="9"/>
-    <w:rsid w:val="00A10FD9"/>
-    <w:rPr>
       <w:rFonts w:asciiTheme="majorHAnsi" w:cstheme="majorBidi" w:eastAsiaTheme="majorEastAsia" w:hAnsiTheme="majorHAnsi"/>
-      <w:color w:themeColor="accent1" w:themeShade="BF" w:val="0F4761"/>
-      <w:sz w:val="40"/>
-      <w:szCs w:val="40"/>
-    </w:rPr>
-  </w:style>
-  <w:style w:customStyle="1" w:styleId="Heading2Char" w:type="character">
-    <w:name w:val="Heading 2 Char"/>
-    <w:basedOn w:val="DefaultParagraphFont"/>
-    <w:link w:val="Heading2"/>
-    <w:uiPriority w:val="9"/>
-    <w:semiHidden/>
-    <w:rsid w:val="00A10FD9"/>
-    <w:rPr>
-      <w:rFonts w:asciiTheme="majorHAnsi" w:cstheme="majorBidi" w:eastAsiaTheme="majorEastAsia" w:hAnsiTheme="majorHAnsi"/>
-      <w:color w:themeColor="accent1" w:themeShade="BF" w:val="0F4761"/>
-      <w:sz w:val="32"/>
-      <w:szCs w:val="32"/>
-    </w:rPr>
-  </w:style>
-  <w:style w:customStyle="1" w:styleId="Heading3Char" w:type="character">
-    <w:name w:val="Heading 3 Char"/>
-    <w:basedOn w:val="DefaultParagraphFont"/>
-    <w:link w:val="Heading3"/>
-    <w:uiPriority w:val="9"/>
-    <w:semiHidden/>
-    <w:rsid w:val="00A10FD9"/>
-    <w:rPr>
-      <w:rFonts w:cstheme="majorBidi" w:eastAsiaTheme="majorEastAsia"/>
-      <w:color w:themeColor="accent1" w:themeShade="BF" w:val="0F4761"/>
-      <w:sz w:val="28"/>
-      <w:szCs w:val="28"/>
-    </w:rPr>
-  </w:style>
-  <w:style w:customStyle="1" w:styleId="Heading4Char" w:type="character">
-    <w:name w:val="Heading 4 Char"/>
-    <w:basedOn w:val="DefaultParagraphFont"/>
-    <w:link w:val="Heading4"/>
-    <w:uiPriority w:val="9"/>
-    <w:semiHidden/>
-    <w:rsid w:val="00A10FD9"/>
-    <w:rPr>
-      <w:rFonts w:cstheme="majorBidi" w:eastAsiaTheme="majorEastAsia"/>
-      <w:i/>
-      <w:iCs/>
-      <w:color w:themeColor="accent1" w:themeShade="BF" w:val="0F4761"/>
-    </w:rPr>
-  </w:style>
-  <w:style w:customStyle="1" w:styleId="Heading5Char" w:type="character">
-    <w:name w:val="Heading 5 Char"/>
-    <w:basedOn w:val="DefaultParagraphFont"/>
-    <w:link w:val="Heading5"/>
-    <w:uiPriority w:val="9"/>
-    <w:semiHidden/>
-    <w:rsid w:val="00A10FD9"/>
-    <w:rPr>
-      <w:rFonts w:cstheme="majorBidi" w:eastAsiaTheme="majorEastAsia"/>
-      <w:color w:themeColor="accent1" w:themeShade="BF" w:val="0F4761"/>
-    </w:rPr>
-  </w:style>
-  <w:style w:customStyle="1" w:styleId="Heading6Char" w:type="character">
-    <w:name w:val="Heading 6 Char"/>
-    <w:basedOn w:val="DefaultParagraphFont"/>
-    <w:link w:val="Heading6"/>
-    <w:uiPriority w:val="9"/>
-    <w:semiHidden/>
-    <w:rsid w:val="00A10FD9"/>
-    <w:rPr>
-      <w:rFonts w:cstheme="majorBidi" w:eastAsiaTheme="majorEastAsia"/>
-      <w:i/>
-      <w:iCs/>
-      <w:color w:themeColor="text1" w:themeTint="A6" w:val="595959"/>
-    </w:rPr>
-  </w:style>
-  <w:style w:customStyle="1" w:styleId="Heading7Char" w:type="character">
-    <w:name w:val="Heading 7 Char"/>
-    <w:basedOn w:val="DefaultParagraphFont"/>
-    <w:link w:val="Heading7"/>
-    <w:uiPriority w:val="9"/>
-    <w:semiHidden/>
-    <w:rsid w:val="00A10FD9"/>
-    <w:rPr>
-      <w:rFonts w:cstheme="majorBidi" w:eastAsiaTheme="majorEastAsia"/>
-      <w:color w:themeColor="text1" w:themeTint="A6" w:val="595959"/>
-    </w:rPr>
-  </w:style>
-  <w:style w:customStyle="1" w:styleId="Heading8Char" w:type="character">
-    <w:name w:val="Heading 8 Char"/>
-    <w:basedOn w:val="DefaultParagraphFont"/>
-    <w:link w:val="Heading8"/>
-    <w:uiPriority w:val="9"/>
-    <w:semiHidden/>
-    <w:rsid w:val="00A10FD9"/>
-    <w:rPr>
-      <w:rFonts w:cstheme="majorBidi" w:eastAsiaTheme="majorEastAsia"/>
-      <w:i/>
-      <w:iCs/>
-      <w:color w:themeColor="text1" w:themeTint="D8" w:val="272727"/>
-    </w:rPr>
-  </w:style>
-  <w:style w:customStyle="1" w:styleId="Heading9Char" w:type="character">
-    <w:name w:val="Heading 9 Char"/>
-    <w:basedOn w:val="DefaultParagraphFont"/>
-    <w:link w:val="Heading9"/>
-    <w:uiPriority w:val="9"/>
-    <w:semiHidden/>
-    <w:rsid w:val="00A10FD9"/>
-    <w:rPr>
-      <w:rFonts w:cstheme="majorBidi" w:eastAsiaTheme="majorEastAsia"/>
-      <w:color w:themeColor="text1" w:themeTint="D8" w:val="272727"/>
+      <w:color w:themeColor="accent1" w:val="4F81BD"/>
+      <w:sz w:val="24"/>
+      <w:szCs w:val="24"/>
     </w:rPr>
   </w:style>
   <w:style w:styleId="BlockText" w:type="paragraph">
@@ -2565,8 +2352,8 @@
   </w:style>
   <w:style w:styleId="FootnoteBlockText" w:type="paragraph">
     <w:name w:val="Footnote Block Text"/>
-    <w:basedOn w:val="FootnoteText"/>
-    <w:next w:val="FootnoteText"/>
+    <w:basedOn w:val="Footnote Text"/>
+    <w:next w:val="Footnote Text"/>
     <w:uiPriority w:val="9"/>
     <w:unhideWhenUsed/>
     <w:qFormat/>
@@ -2958,44 +2745,44 @@
         <a:sysClr val="window" lastClr="FFFFFF"/>
       </a:lt1>
       <a:dk2>
-        <a:srgbClr val="0E2841"/>
+        <a:srgbClr val="1F497D"/>
       </a:dk2>
       <a:lt2>
-        <a:srgbClr val="E8E8E8"/>
+        <a:srgbClr val="EEECE1"/>
       </a:lt2>
       <a:accent1>
-        <a:srgbClr val="156082"/>
+        <a:srgbClr val="4F81BD"/>
       </a:accent1>
       <a:accent2>
-        <a:srgbClr val="E97132"/>
+        <a:srgbClr val="C0504D"/>
       </a:accent2>
       <a:accent3>
-        <a:srgbClr val="196B24"/>
+        <a:srgbClr val="9BBB59"/>
       </a:accent3>
       <a:accent4>
-        <a:srgbClr val="0F9ED5"/>
+        <a:srgbClr val="8064A2"/>
       </a:accent4>
       <a:accent5>
-        <a:srgbClr val="A02B93"/>
+        <a:srgbClr val="4BACC6"/>
       </a:accent5>
       <a:accent6>
-        <a:srgbClr val="4EA72E"/>
+        <a:srgbClr val="F79646"/>
       </a:accent6>
       <a:hlink>
-        <a:srgbClr val="467886"/>
+        <a:srgbClr val="0000FF"/>
       </a:hlink>
       <a:folHlink>
-        <a:srgbClr val="96607D"/>
+        <a:srgbClr val="800080"/>
       </a:folHlink>
     </a:clrScheme>
     <a:fontScheme name="Office">
       <a:majorFont>
-        <a:latin typeface="Aptos Display" panose="02110004020202020204"/>
+        <a:latin typeface="Calibri"/>
         <a:ea typeface=""/>
         <a:cs typeface=""/>
-        <a:font script="Jpan" typeface="游ゴシック Light"/>
+        <a:font script="Jpan" typeface="ＭＳ ゴシック"/>
         <a:font script="Hang" typeface="맑은 고딕"/>
-        <a:font script="Hans" typeface="等线 Light"/>
+        <a:font script="Hans" typeface="宋体"/>
         <a:font script="Hant" typeface="新細明體"/>
         <a:font script="Arab" typeface="Times New Roman"/>
         <a:font script="Hebr" typeface="Times New Roman"/>
@@ -3022,32 +2809,14 @@
         <a:font script="Mong" typeface="Mongolian Baiti"/>
         <a:font script="Viet" typeface="Times New Roman"/>
         <a:font script="Uigh" typeface="Microsoft Uighur"/>
-        <a:font script="Geor" typeface="Sylfaen"/>
-        <a:font script="Armn" typeface="Arial"/>
-        <a:font script="Bugi" typeface="Leelawadee UI"/>
-        <a:font script="Bopo" typeface="Microsoft JhengHei"/>
-        <a:font script="Java" typeface="Javanese Text"/>
-        <a:font script="Lisu" typeface="Segoe UI"/>
-        <a:font script="Mymr" typeface="Myanmar Text"/>
-        <a:font script="Nkoo" typeface="Ebrima"/>
-        <a:font script="Olck" typeface="Nirmala UI"/>
-        <a:font script="Osma" typeface="Ebrima"/>
-        <a:font script="Phag" typeface="Phagspa"/>
-        <a:font script="Syrn" typeface="Estrangelo Edessa"/>
-        <a:font script="Syrj" typeface="Estrangelo Edessa"/>
-        <a:font script="Syre" typeface="Estrangelo Edessa"/>
-        <a:font script="Sora" typeface="Nirmala UI"/>
-        <a:font script="Tale" typeface="Microsoft Tai Le"/>
-        <a:font script="Talu" typeface="Microsoft New Tai Lue"/>
-        <a:font script="Tfng" typeface="Ebrima"/>
       </a:majorFont>
       <a:minorFont>
-        <a:latin typeface="Aptos" panose="02110004020202020204"/>
+        <a:latin typeface="Cambria"/>
         <a:ea typeface=""/>
         <a:cs typeface=""/>
-        <a:font script="Jpan" typeface="游明朝"/>
+        <a:font script="Jpan" typeface="ＭＳ 明朝"/>
         <a:font script="Hang" typeface="맑은 고딕"/>
-        <a:font script="Hans" typeface="等线"/>
+        <a:font script="Hans" typeface="宋体"/>
         <a:font script="Hant" typeface="新細明體"/>
         <a:font script="Arab" typeface="Arial"/>
         <a:font script="Hebr" typeface="Arial"/>
@@ -3074,24 +2843,6 @@
         <a:font script="Mong" typeface="Mongolian Baiti"/>
         <a:font script="Viet" typeface="Arial"/>
         <a:font script="Uigh" typeface="Microsoft Uighur"/>
-        <a:font script="Geor" typeface="Sylfaen"/>
-        <a:font script="Armn" typeface="Arial"/>
-        <a:font script="Bugi" typeface="Leelawadee UI"/>
-        <a:font script="Bopo" typeface="Microsoft JhengHei"/>
-        <a:font script="Java" typeface="Javanese Text"/>
-        <a:font script="Lisu" typeface="Segoe UI"/>
-        <a:font script="Mymr" typeface="Myanmar Text"/>
-        <a:font script="Nkoo" typeface="Ebrima"/>
-        <a:font script="Olck" typeface="Nirmala UI"/>
-        <a:font script="Osma" typeface="Ebrima"/>
-        <a:font script="Phag" typeface="Phagspa"/>
-        <a:font script="Syrn" typeface="Estrangelo Edessa"/>
-        <a:font script="Syrj" typeface="Estrangelo Edessa"/>
-        <a:font script="Syre" typeface="Estrangelo Edessa"/>
-        <a:font script="Sora" typeface="Nirmala UI"/>
-        <a:font script="Tale" typeface="Microsoft Tai Le"/>
-        <a:font script="Talu" typeface="Microsoft New Tai Lue"/>
-        <a:font script="Tfng" typeface="Ebrima"/>
       </a:minorFont>
     </a:fontScheme>
     <a:fmtScheme name="Office">
@@ -3103,141 +2854,200 @@
           <a:gsLst>
             <a:gs pos="0">
               <a:schemeClr val="phClr">
-                <a:lumMod val="110000"/>
-                <a:satMod val="105000"/>
-                <a:tint val="67000"/>
+                <a:tint val="50000"/>
+                <a:satMod val="300000"/>
               </a:schemeClr>
             </a:gs>
-            <a:gs pos="50000">
+            <a:gs pos="35000">
               <a:schemeClr val="phClr">
-                <a:lumMod val="105000"/>
-                <a:satMod val="103000"/>
-                <a:tint val="73000"/>
+                <a:tint val="37000"/>
+                <a:satMod val="300000"/>
               </a:schemeClr>
             </a:gs>
             <a:gs pos="100000">
               <a:schemeClr val="phClr">
-                <a:lumMod val="105000"/>
-                <a:satMod val="109000"/>
-                <a:tint val="81000"/>
+                <a:tint val="15000"/>
+                <a:satMod val="350000"/>
               </a:schemeClr>
             </a:gs>
           </a:gsLst>
-          <a:lin ang="5400000" scaled="0"/>
+          <a:lin ang="16200000" scaled="1"/>
         </a:gradFill>
         <a:gradFill rotWithShape="1">
           <a:gsLst>
             <a:gs pos="0">
               <a:schemeClr val="phClr">
-                <a:satMod val="103000"/>
-                <a:lumMod val="102000"/>
-                <a:tint val="94000"/>
-              </a:schemeClr>
-            </a:gs>
-            <a:gs pos="50000">
-              <a:schemeClr val="phClr">
-                <a:satMod val="110000"/>
-                <a:lumMod val="100000"/>
+                <a:tint val="100000"/>
                 <a:shade val="100000"/>
+                <a:satMod val="130000"/>
               </a:schemeClr>
             </a:gs>
             <a:gs pos="100000">
               <a:schemeClr val="phClr">
-                <a:lumMod val="99000"/>
-                <a:satMod val="120000"/>
-                <a:shade val="78000"/>
+                <a:tint val="50000"/>
+                <a:shade val="100000"/>
+                <a:satMod val="350000"/>
               </a:schemeClr>
             </a:gs>
           </a:gsLst>
-          <a:lin ang="5400000" scaled="0"/>
+          <a:lin ang="16200000" scaled="0"/>
         </a:gradFill>
       </a:fillStyleLst>
       <a:lnStyleLst>
-        <a:ln w="6350" cap="flat" cmpd="sng" algn="ctr">
+        <a:ln w="9525" cap="flat" cmpd="sng" algn="ctr">
+          <a:solidFill>
+            <a:schemeClr val="phClr">
+              <a:shade val="95000"/>
+              <a:satMod val="105000"/>
+            </a:schemeClr>
+          </a:solidFill>
+          <a:prstDash val="solid"/>
+        </a:ln>
+        <a:ln w="25400" cap="flat" cmpd="sng" algn="ctr">
           <a:solidFill>
             <a:schemeClr val="phClr"/>
           </a:solidFill>
           <a:prstDash val="solid"/>
-          <a:miter lim="800000"/>
         </a:ln>
-        <a:ln w="12700" cap="flat" cmpd="sng" algn="ctr">
+        <a:ln w="38100" cap="flat" cmpd="sng" algn="ctr">
           <a:solidFill>
             <a:schemeClr val="phClr"/>
           </a:solidFill>
           <a:prstDash val="solid"/>
-          <a:miter lim="800000"/>
-        </a:ln>
-        <a:ln w="19050" cap="flat" cmpd="sng" algn="ctr">
-          <a:solidFill>
-            <a:schemeClr val="phClr"/>
-          </a:solidFill>
-          <a:prstDash val="solid"/>
-          <a:miter lim="800000"/>
         </a:ln>
       </a:lnStyleLst>
       <a:effectStyleLst>
         <a:effectStyle>
-          <a:effectLst/>
-        </a:effectStyle>
-        <a:effectStyle>
-          <a:effectLst/>
+          <a:effectLst>
+            <a:outerShdw blurRad="40000" dist="20000" dir="5400000" rotWithShape="0">
+              <a:srgbClr val="000000">
+                <a:alpha val="38000"/>
+              </a:srgbClr>
+            </a:outerShdw>
+          </a:effectLst>
         </a:effectStyle>
         <a:effectStyle>
           <a:effectLst>
-            <a:outerShdw blurRad="57150" dist="19050" dir="5400000" algn="ctr" rotWithShape="0">
+            <a:outerShdw blurRad="40000" dist="23000" dir="5400000" rotWithShape="0">
               <a:srgbClr val="000000">
-                <a:alpha val="63000"/>
+                <a:alpha val="35000"/>
               </a:srgbClr>
             </a:outerShdw>
           </a:effectLst>
+        </a:effectStyle>
+        <a:effectStyle>
+          <a:effectLst>
+            <a:outerShdw blurRad="40000" dist="23000" dir="5400000" rotWithShape="0">
+              <a:srgbClr val="000000">
+                <a:alpha val="35000"/>
+              </a:srgbClr>
+            </a:outerShdw>
+          </a:effectLst>
+          <a:scene3d>
+            <a:camera prst="orthographicFront">
+              <a:rot lat="0" lon="0" rev="0"/>
+            </a:camera>
+            <a:lightRig rig="threePt" dir="t">
+              <a:rot lat="0" lon="0" rev="1200000"/>
+            </a:lightRig>
+          </a:scene3d>
+          <a:sp3d>
+            <a:bevelT w="63500" h="25400"/>
+          </a:sp3d>
         </a:effectStyle>
       </a:effectStyleLst>
       <a:bgFillStyleLst>
         <a:solidFill>
           <a:schemeClr val="phClr"/>
         </a:solidFill>
-        <a:solidFill>
-          <a:schemeClr val="phClr">
-            <a:tint val="95000"/>
-            <a:satMod val="170000"/>
-          </a:schemeClr>
-        </a:solidFill>
         <a:gradFill rotWithShape="1">
           <a:gsLst>
             <a:gs pos="0">
               <a:schemeClr val="phClr">
-                <a:tint val="93000"/>
-                <a:satMod val="150000"/>
-                <a:shade val="98000"/>
-                <a:lumMod val="102000"/>
+                <a:tint val="40000"/>
+                <a:satMod val="350000"/>
               </a:schemeClr>
             </a:gs>
-            <a:gs pos="50000">
+            <a:gs pos="40000">
               <a:schemeClr val="phClr">
-                <a:tint val="98000"/>
-                <a:satMod val="130000"/>
-                <a:shade val="90000"/>
-                <a:lumMod val="103000"/>
+                <a:tint val="45000"/>
+                <a:shade val="99000"/>
+                <a:satMod val="350000"/>
               </a:schemeClr>
             </a:gs>
             <a:gs pos="100000">
               <a:schemeClr val="phClr">
-                <a:shade val="63000"/>
-                <a:satMod val="120000"/>
+                <a:shade val="20000"/>
+                <a:satMod val="255000"/>
               </a:schemeClr>
             </a:gs>
           </a:gsLst>
-          <a:lin ang="5400000" scaled="0"/>
+          <a:path path="circle">
+            <a:fillToRect l="50000" t="-80000" r="50000" b="180000"/>
+          </a:path>
+        </a:gradFill>
+        <a:gradFill rotWithShape="1">
+          <a:gsLst>
+            <a:gs pos="0">
+              <a:schemeClr val="phClr">
+                <a:tint val="80000"/>
+                <a:satMod val="300000"/>
+              </a:schemeClr>
+            </a:gs>
+            <a:gs pos="100000">
+              <a:schemeClr val="phClr">
+                <a:shade val="30000"/>
+                <a:satMod val="200000"/>
+              </a:schemeClr>
+            </a:gs>
+          </a:gsLst>
+          <a:path path="circle">
+            <a:fillToRect l="50000" t="50000" r="50000" b="50000"/>
+          </a:path>
         </a:gradFill>
       </a:bgFillStyleLst>
     </a:fmtScheme>
   </a:themeElements>
-  <a:objectDefaults/>
+  <a:objectDefaults>
+    <a:spDef>
+      <a:spPr/>
+      <a:bodyPr/>
+      <a:lstStyle/>
+      <a:style>
+        <a:lnRef idx="1">
+          <a:schemeClr val="accent1"/>
+        </a:lnRef>
+        <a:fillRef idx="3">
+          <a:schemeClr val="accent1"/>
+        </a:fillRef>
+        <a:effectRef idx="2">
+          <a:schemeClr val="accent1"/>
+        </a:effectRef>
+        <a:fontRef idx="minor">
+          <a:schemeClr val="lt1"/>
+        </a:fontRef>
+      </a:style>
+    </a:spDef>
+    <a:lnDef>
+      <a:spPr/>
+      <a:bodyPr/>
+      <a:lstStyle/>
+      <a:style>
+        <a:lnRef idx="2">
+          <a:schemeClr val="accent1"/>
+        </a:lnRef>
+        <a:fillRef idx="0">
+          <a:schemeClr val="accent1"/>
+        </a:fillRef>
+        <a:effectRef idx="1">
+          <a:schemeClr val="accent1"/>
+        </a:effectRef>
+        <a:fontRef idx="minor">
+          <a:schemeClr val="tx1"/>
+        </a:fontRef>
+      </a:style>
+    </a:lnDef>
+  </a:objectDefaults>
   <a:extraClrSchemeLst/>
-  <a:extLst>
-    <a:ext uri="{05A4C25C-085E-4340-85A3-A5531E510DB2}">
-      <thm15:themeFamily xmlns:thm15="http://schemas.microsoft.com/office/thememl/2012/main" name="Office Theme" id="{2E142A2C-CD16-42D6-873A-C26D2A0506FA}" vid="{1BDDFF52-6CD6-40A5-AB3C-68EB2F1E4D0A}"/>
-    </a:ext>
-  </a:extLst>
 </a:theme>
 </file>
</xml_diff>

<commit_message>
Small changes to formatting. Highlight Python usage
</commit_message>
<xml_diff>
--- a/target/resume.docx
+++ b/target/resume.docx
@@ -386,7 +386,7 @@
         </w:numPr>
       </w:pPr>
       <w:r>
-        <w:t xml:space="preserve">Develop and maintain automated data collection systems for grocery-related datasets</w:t>
+        <w:t xml:space="preserve">Develop and maintain automated data collection systems, written in Scala, for grocery-related datasets</w:t>
       </w:r>
     </w:p>
     <w:p>
@@ -398,7 +398,19 @@
         </w:numPr>
       </w:pPr>
       <w:r>
-        <w:t xml:space="preserve">Reverse engineer proprietary web APIs and integrate them into a unified data pipeline</w:t>
+        <w:t xml:space="preserve">Maintain Airflow DAGs written in Python</w:t>
+      </w:r>
+    </w:p>
+    <w:p>
+      <w:pPr>
+        <w:pStyle w:val="Compact"/>
+        <w:numPr>
+          <w:ilvl w:val="0"/>
+          <w:numId w:val="1003"/>
+        </w:numPr>
+      </w:pPr>
+      <w:r>
+        <w:t xml:space="preserve">Reverse engineer web APIs and integrate them into a unified data pipeline</w:t>
       </w:r>
     </w:p>
     <w:p>

</xml_diff>